<commit_message>
chore: ignore Office lock files
</commit_message>
<xml_diff>
--- a/docs/report/SalaryBridge_Project_Report.docx
+++ b/docs/report/SalaryBridge_Project_Report.docx
@@ -12,7 +12,43 @@
           <w:bCs/>
           <w:color w:val="00876A"/>
         </w:rPr>
-        <w:t>DIU CPC × upay AI Hackathon 2026  ·  Project Report</w:t>
+        <w:t xml:space="preserve">DIU CPC × </w:t>
+      </w:r>
+      <w:proofErr w:type="spellStart"/>
+      <w:r>
+        <w:rPr>
+          <w:b/>
+          <w:bCs/>
+          <w:color w:val="00876A"/>
+        </w:rPr>
+        <w:t>upay</w:t>
+      </w:r>
+      <w:proofErr w:type="spellEnd"/>
+      <w:r>
+        <w:rPr>
+          <w:b/>
+          <w:bCs/>
+          <w:color w:val="00876A"/>
+        </w:rPr>
+        <w:t xml:space="preserve"> AI Hackathon </w:t>
+      </w:r>
+      <w:proofErr w:type="gramStart"/>
+      <w:r>
+        <w:rPr>
+          <w:b/>
+          <w:bCs/>
+          <w:color w:val="00876A"/>
+        </w:rPr>
+        <w:t>2026  ·</w:t>
+      </w:r>
+      <w:proofErr w:type="gramEnd"/>
+      <w:r>
+        <w:rPr>
+          <w:b/>
+          <w:bCs/>
+          <w:color w:val="00876A"/>
+        </w:rPr>
+        <w:t xml:space="preserve">  Project Report</w:t>
       </w:r>
     </w:p>
     <w:p>
@@ -40,7 +76,23 @@
           <w:sz w:val="30"/>
           <w:szCs w:val="30"/>
         </w:rPr>
-        <w:t>AI-powered earned-wage access for upay, repaid by the employer on payday</w:t>
+        <w:t xml:space="preserve">AI-powered earned-wage access for </w:t>
+      </w:r>
+      <w:proofErr w:type="spellStart"/>
+      <w:r>
+        <w:rPr>
+          <w:sz w:val="30"/>
+          <w:szCs w:val="30"/>
+        </w:rPr>
+        <w:t>upay</w:t>
+      </w:r>
+      <w:proofErr w:type="spellEnd"/>
+      <w:r>
+        <w:rPr>
+          <w:sz w:val="30"/>
+          <w:szCs w:val="30"/>
+        </w:rPr>
+        <w:t>, repaid by the employer on payday</w:t>
       </w:r>
     </w:p>
     <w:tbl>
@@ -65,12 +117,6 @@
         <w:gridCol w:w="7438"/>
       </w:tblGrid>
       <w:tr>
-        <w:tblPrEx>
-          <w:tblCellMar>
-            <w:top w:w="0" w:type="dxa"/>
-            <w:bottom w:w="0" w:type="dxa"/>
-          </w:tblCellMar>
-        </w:tblPrEx>
         <w:tc>
           <w:tcPr>
             <w:tcW w:w="2200" w:type="dxa"/>
@@ -133,12 +179,6 @@
         </w:tc>
       </w:tr>
       <w:tr>
-        <w:tblPrEx>
-          <w:tblCellMar>
-            <w:top w:w="0" w:type="dxa"/>
-            <w:bottom w:w="0" w:type="dxa"/>
-          </w:tblCellMar>
-        </w:tblPrEx>
         <w:tc>
           <w:tcPr>
             <w:tcW w:w="2200" w:type="dxa"/>
@@ -195,18 +235,12 @@
                 <w:sz w:val="19"/>
                 <w:szCs w:val="19"/>
               </w:rPr>
-              <w:t>[Team Name]</w:t>
+              <w:t>NeuroVerse</w:t>
             </w:r>
           </w:p>
         </w:tc>
       </w:tr>
       <w:tr>
-        <w:tblPrEx>
-          <w:tblCellMar>
-            <w:top w:w="0" w:type="dxa"/>
-            <w:bottom w:w="0" w:type="dxa"/>
-          </w:tblCellMar>
-        </w:tblPrEx>
         <w:tc>
           <w:tcPr>
             <w:tcW w:w="2200" w:type="dxa"/>
@@ -257,24 +291,165 @@
           <w:p>
             <w:pPr>
               <w:spacing w:line="252" w:lineRule="auto"/>
-            </w:pPr>
-            <w:r>
-              <w:rPr>
-                <w:sz w:val="19"/>
-                <w:szCs w:val="19"/>
-              </w:rPr>
-              <w:t>[Member 1 — role, student ID]  ·  [Member 2 — role, student ID]  ·  [Member 3 — role, student ID]</w:t>
+              <w:rPr>
+                <w:sz w:val="19"/>
+                <w:szCs w:val="19"/>
+              </w:rPr>
+            </w:pPr>
+            <w:r>
+              <w:rPr>
+                <w:b/>
+                <w:bCs/>
+                <w:sz w:val="19"/>
+                <w:szCs w:val="19"/>
+              </w:rPr>
+              <w:t>Md Abdul Quym Shanto</w:t>
+            </w:r>
+            <w:r>
+              <w:rPr>
+                <w:sz w:val="19"/>
+                <w:szCs w:val="19"/>
+              </w:rPr>
+              <w:t xml:space="preserve"> — </w:t>
+            </w:r>
+            <w:r>
+              <w:rPr>
+                <w:sz w:val="19"/>
+                <w:szCs w:val="19"/>
+              </w:rPr>
+              <w:t>Leader, Frontend, Ai Engineer</w:t>
+            </w:r>
+            <w:r>
+              <w:rPr>
+                <w:sz w:val="19"/>
+                <w:szCs w:val="19"/>
+              </w:rPr>
+              <w:t xml:space="preserve">, </w:t>
+            </w:r>
+            <w:r>
+              <w:rPr>
+                <w:sz w:val="19"/>
+                <w:szCs w:val="19"/>
+              </w:rPr>
+              <w:t>241-15-053</w:t>
+            </w:r>
+            <w:r>
+              <w:rPr>
+                <w:sz w:val="19"/>
+                <w:szCs w:val="19"/>
+              </w:rPr>
+              <w:t xml:space="preserve"> </w:t>
+            </w:r>
+          </w:p>
+          <w:p>
+            <w:pPr>
+              <w:spacing w:line="252" w:lineRule="auto"/>
+              <w:rPr>
+                <w:sz w:val="19"/>
+                <w:szCs w:val="19"/>
+              </w:rPr>
+            </w:pPr>
+            <w:r>
+              <w:rPr>
+                <w:b/>
+                <w:bCs/>
+                <w:sz w:val="19"/>
+                <w:szCs w:val="19"/>
+              </w:rPr>
+              <w:t>Sajid Ahasan</w:t>
+            </w:r>
+            <w:r>
+              <w:rPr>
+                <w:sz w:val="19"/>
+                <w:szCs w:val="19"/>
+              </w:rPr>
+              <w:t xml:space="preserve">— </w:t>
+            </w:r>
+            <w:r>
+              <w:rPr>
+                <w:sz w:val="19"/>
+                <w:szCs w:val="19"/>
+              </w:rPr>
+              <w:t>Ai/ML</w:t>
+            </w:r>
+            <w:r>
+              <w:rPr>
+                <w:sz w:val="19"/>
+                <w:szCs w:val="19"/>
+              </w:rPr>
+              <w:t xml:space="preserve">, </w:t>
+            </w:r>
+            <w:r>
+              <w:rPr>
+                <w:sz w:val="19"/>
+                <w:szCs w:val="19"/>
+              </w:rPr>
+              <w:t>241-15-909</w:t>
+            </w:r>
+            <w:r>
+              <w:rPr>
+                <w:sz w:val="19"/>
+                <w:szCs w:val="19"/>
+              </w:rPr>
+              <w:t xml:space="preserve">  </w:t>
+            </w:r>
+          </w:p>
+          <w:p>
+            <w:pPr>
+              <w:spacing w:line="252" w:lineRule="auto"/>
+              <w:rPr>
+                <w:sz w:val="19"/>
+                <w:szCs w:val="19"/>
+              </w:rPr>
+            </w:pPr>
+            <w:r>
+              <w:rPr>
+                <w:b/>
+                <w:bCs/>
+                <w:sz w:val="19"/>
+                <w:szCs w:val="19"/>
+              </w:rPr>
+              <w:t>Sakibul Hasan Sakib</w:t>
+            </w:r>
+            <w:r>
+              <w:rPr>
+                <w:sz w:val="19"/>
+                <w:szCs w:val="19"/>
+              </w:rPr>
+              <w:t xml:space="preserve"> — </w:t>
+            </w:r>
+            <w:r>
+              <w:rPr>
+                <w:sz w:val="19"/>
+                <w:szCs w:val="19"/>
+              </w:rPr>
+              <w:t>Backend Engineer</w:t>
+            </w:r>
+            <w:r>
+              <w:rPr>
+                <w:sz w:val="19"/>
+                <w:szCs w:val="19"/>
+              </w:rPr>
+              <w:t>,</w:t>
+            </w:r>
+            <w:r>
+              <w:rPr>
+                <w:sz w:val="19"/>
+                <w:szCs w:val="19"/>
+              </w:rPr>
+              <w:t xml:space="preserve"> </w:t>
+            </w:r>
+            <w:r>
+              <w:rPr>
+                <w:sz w:val="19"/>
+                <w:szCs w:val="19"/>
+              </w:rPr>
+              <w:t>241-15-048</w:t>
             </w:r>
           </w:p>
         </w:tc>
       </w:tr>
       <w:tr>
-        <w:tblPrEx>
-          <w:tblCellMar>
-            <w:top w:w="0" w:type="dxa"/>
-            <w:bottom w:w="0" w:type="dxa"/>
-          </w:tblCellMar>
-        </w:tblPrEx>
         <w:tc>
           <w:tcPr>
             <w:tcW w:w="2200" w:type="dxa"/>
@@ -331,18 +506,19 @@
                 <w:sz w:val="19"/>
                 <w:szCs w:val="19"/>
               </w:rPr>
-              <w:t>[Department], Daffodil International University</w:t>
+              <w:t>Computer Science and Engineering</w:t>
+            </w:r>
+            <w:r>
+              <w:rPr>
+                <w:sz w:val="19"/>
+                <w:szCs w:val="19"/>
+              </w:rPr>
+              <w:t>, Daffodil International University</w:t>
             </w:r>
           </w:p>
         </w:tc>
       </w:tr>
       <w:tr>
-        <w:tblPrEx>
-          <w:tblCellMar>
-            <w:top w:w="0" w:type="dxa"/>
-            <w:bottom w:w="0" w:type="dxa"/>
-          </w:tblCellMar>
-        </w:tblPrEx>
         <w:tc>
           <w:tcPr>
             <w:tcW w:w="2200" w:type="dxa"/>
@@ -406,12 +582,6 @@
         </w:tc>
       </w:tr>
       <w:tr>
-        <w:tblPrEx>
-          <w:tblCellMar>
-            <w:top w:w="0" w:type="dxa"/>
-            <w:bottom w:w="0" w:type="dxa"/>
-          </w:tblCellMar>
-        </w:tblPrEx>
         <w:tc>
           <w:tcPr>
             <w:tcW w:w="2200" w:type="dxa"/>
@@ -475,12 +645,6 @@
         </w:tc>
       </w:tr>
       <w:tr>
-        <w:tblPrEx>
-          <w:tblCellMar>
-            <w:top w:w="0" w:type="dxa"/>
-            <w:bottom w:w="0" w:type="dxa"/>
-          </w:tblCellMar>
-        </w:tblPrEx>
         <w:tc>
           <w:tcPr>
             <w:tcW w:w="2200" w:type="dxa"/>
@@ -532,13 +696,16 @@
             <w:pPr>
               <w:spacing w:line="252" w:lineRule="auto"/>
             </w:pPr>
-            <w:r>
-              <w:rPr>
-                <w:sz w:val="19"/>
-                <w:szCs w:val="19"/>
-              </w:rPr>
-              <w:t>[Google Drive / YouTube link]</w:t>
-            </w:r>
+            <w:hyperlink r:id="rId9" w:history="1">
+              <w:r>
+                <w:rPr>
+                  <w:rStyle w:val="Hyperlink"/>
+                  <w:sz w:val="19"/>
+                  <w:szCs w:val="19"/>
+                </w:rPr>
+                <w:t>https://drive.google.com/drive/folders/18cgFP-ZswDTM1POsnOrVzhjxlWLzCTIX?usp=sharing</w:t>
+              </w:r>
+            </w:hyperlink>
           </w:p>
         </w:tc>
       </w:tr>
@@ -555,7 +722,29 @@
           <w:sz w:val="18"/>
           <w:szCs w:val="18"/>
         </w:rPr>
-        <w:t>All data in this project is synthetic. No real customer, employer or upay data was used.</w:t>
+        <w:t xml:space="preserve">All data in this project is synthetic. No real customer, employer or </w:t>
+      </w:r>
+      <w:proofErr w:type="spellStart"/>
+      <w:r>
+        <w:rPr>
+          <w:i/>
+          <w:iCs/>
+          <w:color w:val="5B6B73"/>
+          <w:sz w:val="18"/>
+          <w:szCs w:val="18"/>
+        </w:rPr>
+        <w:t>upay</w:t>
+      </w:r>
+      <w:proofErr w:type="spellEnd"/>
+      <w:r>
+        <w:rPr>
+          <w:i/>
+          <w:iCs/>
+          <w:color w:val="5B6B73"/>
+          <w:sz w:val="18"/>
+          <w:szCs w:val="18"/>
+        </w:rPr>
+        <w:t xml:space="preserve"> data was used.</w:t>
       </w:r>
     </w:p>
     <w:p>
@@ -585,7 +774,6 @@
         <w:alias w:val="Contents"/>
         <w:id w:val="1096832262"/>
       </w:sdtPr>
-      <w:sdtEndPr/>
       <w:sdtContent>
         <w:p>
           <w:pPr>
@@ -2433,13 +2621,31 @@
         <w:spacing w:after="120" w:line="276" w:lineRule="auto"/>
       </w:pPr>
       <w:r>
-        <w:t xml:space="preserve">Monthly-paid workers in Bangladesh earn their wages every working day but receive them once a month, so a mid-month emergency often ends in costly informal credit. SalaryBridge is an AI-powered earned-wage access product for upay. A worker can draw up to 20% of salary from wages already earned, for a flat </w:t>
-      </w:r>
-      <w:r>
-        <w:t>৳</w:t>
-      </w:r>
-      <w:r>
-        <w:t>25 fee with no interest, straight into the upay wallet. On payday the employer repays upay in one bulk transfer from a ready-made deduction list.</w:t>
+        <w:t xml:space="preserve">Monthly-paid workers in Bangladesh earn their wages every working day but receive them once a month, so a mid-month emergency often ends in costly informal credit. SalaryBridge is an AI-powered earned-wage access product for </w:t>
+      </w:r>
+      <w:proofErr w:type="spellStart"/>
+      <w:r>
+        <w:t>upay</w:t>
+      </w:r>
+      <w:proofErr w:type="spellEnd"/>
+      <w:r>
+        <w:t xml:space="preserve">. A worker can draw up to 20% of salary from wages already earned, for a flat ৳25 fee with no interest, straight into the </w:t>
+      </w:r>
+      <w:proofErr w:type="spellStart"/>
+      <w:r>
+        <w:t>upay</w:t>
+      </w:r>
+      <w:proofErr w:type="spellEnd"/>
+      <w:r>
+        <w:t xml:space="preserve"> wallet. On payday the employer repays </w:t>
+      </w:r>
+      <w:proofErr w:type="spellStart"/>
+      <w:r>
+        <w:t>upay</w:t>
+      </w:r>
+      <w:proofErr w:type="spellEnd"/>
+      <w:r>
+        <w:t xml:space="preserve"> in one bulk transfer from a ready-made deduction list.</w:t>
       </w:r>
     </w:p>
     <w:p>
@@ -2447,10 +2653,7 @@
         <w:spacing w:after="120" w:line="276" w:lineRule="auto"/>
       </w:pPr>
       <w:r>
-        <w:t>Published rules decide eligibility, while five models size each offer safely: employer late-payroll risk (M1), repayment-risk tiers (M2), risk of leaving before payday (M3), a P10–P90 capital forecast (M4) and a borrowing-pattern monitor (M5). Claude explains every decision in plain English or Bangla from an allow-listed fact sheet. Large, high-risk and unusual cases go to a human queue. On unseen months of a synthetic world, ML tiers cut the loss rate from 0.95% to 0.62% (1.55% to 1.31% in a harsher stress</w:t>
-      </w:r>
-      <w:r>
-        <w:t xml:space="preserve"> world). Eight of ten targets declared before the results pass, and the two misses are disclosed with their causes. The prototype is live with employee, employer, operations and validation views.</w:t>
+        <w:t>Published rules decide eligibility, while five models size each offer safely: employer late-payroll risk (M1), repayment-risk tiers (M2), risk of leaving before payday (M3), a P10–P90 capital forecast (M4) and a borrowing-pattern monitor (M5). Claude explains every decision in plain English or Bangla from an allow-listed fact sheet. Large, high-risk and unusual cases go to a human queue. On unseen months of a synthetic world, ML tiers cut the loss rate from 0.95% to 0.62% (1.55% to 1.31% in a harsher stress world). Eight of ten targets declared before the results pass, and the two misses are disclosed with their causes. The prototype is live with employee, employer, operations and validation views.</w:t>
       </w:r>
     </w:p>
     <w:p>
@@ -2478,19 +2681,7 @@
         <w:spacing w:after="120" w:line="276" w:lineRule="auto"/>
       </w:pPr>
       <w:r>
-        <w:t xml:space="preserve">Garment, factory, retail, school and hospital staff are typically paid once a month. Take Rahim, a garment worker earning </w:t>
-      </w:r>
-      <w:r>
-        <w:t>৳</w:t>
-      </w:r>
-      <w:r>
-        <w:t xml:space="preserve">18,000 a month (a synthetic persona from the sandbox). By 20 October he has earned </w:t>
-      </w:r>
-      <w:r>
-        <w:t>৳</w:t>
-      </w:r>
-      <w:r>
-        <w:t>11,612, yet he can reach none of it until 1 November. When a medicine bill or a school fee arrives in between, he borrows from a shopkeeper, a supervisor or a moneylender: costly, opaque and outside any wallet.</w:t>
+        <w:t>Garment, factory, retail, school and hospital staff are typically paid once a month. Take Rahim, a garment worker earning ৳18,000 a month (a synthetic persona from the sandbox). By 20 October he has earned ৳11,612, yet he can reach none of it until 1 November. When a medicine bill or a school fee arrives in between, he borrows from a shopkeeper, a supervisor or a moneylender: costly, opaque and outside any wallet.</w:t>
       </w:r>
     </w:p>
     <w:p>
@@ -2594,12 +2785,6 @@
         <w:gridCol w:w="9638"/>
       </w:tblGrid>
       <w:tr>
-        <w:tblPrEx>
-          <w:tblCellMar>
-            <w:top w:w="0" w:type="dxa"/>
-            <w:bottom w:w="0" w:type="dxa"/>
-          </w:tblCellMar>
-        </w:tblPrEx>
         <w:tc>
           <w:tcPr>
             <w:tcW w:w="9638" w:type="dxa"/>
@@ -2622,7 +2807,15 @@
               <w:spacing w:after="60" w:line="264" w:lineRule="auto"/>
             </w:pPr>
             <w:r>
-              <w:t xml:space="preserve">For monthly-paid workers such as garment staff, the gap between earning wages and receiving them causes mid-month cash shortfalls that are filled with informal, costly credit. We will build SalaryBridge, an AI-powered earned-wage access product inside upay that uses payroll, tenure, employer reliability and repayment history to size a safe advance and recover it from the employer on payday, </w:t>
+              <w:t xml:space="preserve">For monthly-paid workers such as garment staff, the gap between earning wages and receiving them causes mid-month cash shortfalls that are filled with informal, costly credit. We will build SalaryBridge, an AI-powered earned-wage access product inside </w:t>
+            </w:r>
+            <w:proofErr w:type="spellStart"/>
+            <w:r>
+              <w:t>upay</w:t>
+            </w:r>
+            <w:proofErr w:type="spellEnd"/>
+            <w:r>
+              <w:t xml:space="preserve"> that uses payroll, tenure, employer reliability and repayment history to size a safe advance and recover it from the employer on payday, </w:t>
             </w:r>
             <w:r>
               <w:rPr>
@@ -2646,7 +2839,15 @@
       </w:pPr>
       <w:bookmarkStart w:id="5" w:name="_Toc241980092"/>
       <w:r>
-        <w:t>1.4 Why upay, and why AI</w:t>
+        <w:t xml:space="preserve">1.4 Why </w:t>
+      </w:r>
+      <w:proofErr w:type="spellStart"/>
+      <w:r>
+        <w:t>upay</w:t>
+      </w:r>
+      <w:proofErr w:type="spellEnd"/>
+      <w:r>
+        <w:t>, and why AI</w:t>
       </w:r>
       <w:bookmarkEnd w:id="5"/>
     </w:p>
@@ -2655,7 +2856,15 @@
         <w:spacing w:after="120" w:line="276" w:lineRule="auto"/>
       </w:pPr>
       <w:r>
-        <w:t xml:space="preserve">An MFS already holds the wallet, the verified customer and the payment rails; what it lacks is a safe way to size credit against wages that are earned but not yet paid. AI adds value beyond a fixed rule because risk </w:t>
+        <w:t xml:space="preserve">An MFS already holds the wallet, the verified customer and the payment rails; what it lacks is a safe way to </w:t>
+      </w:r>
+      <w:proofErr w:type="gramStart"/>
+      <w:r>
+        <w:t>size</w:t>
+      </w:r>
+      <w:proofErr w:type="gramEnd"/>
+      <w:r>
+        <w:t xml:space="preserve"> credit against wages that are earned but not yet paid. AI adds value beyond a fixed rule because risk </w:t>
       </w:r>
       <w:r>
         <w:lastRenderedPageBreak/>
@@ -2695,12 +2904,6 @@
         <w:gridCol w:w="1800"/>
       </w:tblGrid>
       <w:tr>
-        <w:tblPrEx>
-          <w:tblCellMar>
-            <w:top w:w="0" w:type="dxa"/>
-            <w:bottom w:w="0" w:type="dxa"/>
-          </w:tblCellMar>
-        </w:tblPrEx>
         <w:trPr>
           <w:tblHeader/>
         </w:trPr>
@@ -2808,12 +3011,6 @@
         </w:tc>
       </w:tr>
       <w:tr>
-        <w:tblPrEx>
-          <w:tblCellMar>
-            <w:top w:w="0" w:type="dxa"/>
-            <w:bottom w:w="0" w:type="dxa"/>
-          </w:tblCellMar>
-        </w:tblPrEx>
         <w:tc>
           <w:tcPr>
             <w:tcW w:w="1500" w:type="dxa"/>
@@ -2840,7 +3037,23 @@
                 <w:sz w:val="19"/>
                 <w:szCs w:val="19"/>
               </w:rPr>
-              <w:t>1. Opt in</w:t>
+              <w:t xml:space="preserve">1. </w:t>
+            </w:r>
+            <w:proofErr w:type="spellStart"/>
+            <w:r>
+              <w:rPr>
+                <w:sz w:val="19"/>
+                <w:szCs w:val="19"/>
+              </w:rPr>
+              <w:t>Opt</w:t>
+            </w:r>
+            <w:proofErr w:type="spellEnd"/>
+            <w:r>
+              <w:rPr>
+                <w:sz w:val="19"/>
+                <w:szCs w:val="19"/>
+              </w:rPr>
+              <w:t xml:space="preserve"> in</w:t>
             </w:r>
           </w:p>
         </w:tc>
@@ -2906,12 +3119,6 @@
         </w:tc>
       </w:tr>
       <w:tr>
-        <w:tblPrEx>
-          <w:tblCellMar>
-            <w:top w:w="0" w:type="dxa"/>
-            <w:bottom w:w="0" w:type="dxa"/>
-          </w:tblCellMar>
-        </w:tblPrEx>
         <w:tc>
           <w:tcPr>
             <w:tcW w:w="1500" w:type="dxa"/>
@@ -2968,7 +3175,23 @@
                 <w:sz w:val="19"/>
                 <w:szCs w:val="19"/>
               </w:rPr>
-              <w:t>The worker opens SalaryBridge in upay, picks an amount and sees the fee, total deduction and date before confirming.</w:t>
+              <w:t xml:space="preserve">The worker opens SalaryBridge in </w:t>
+            </w:r>
+            <w:proofErr w:type="spellStart"/>
+            <w:r>
+              <w:rPr>
+                <w:sz w:val="19"/>
+                <w:szCs w:val="19"/>
+              </w:rPr>
+              <w:t>upay</w:t>
+            </w:r>
+            <w:proofErr w:type="spellEnd"/>
+            <w:r>
+              <w:rPr>
+                <w:sz w:val="19"/>
+                <w:szCs w:val="19"/>
+              </w:rPr>
+              <w:t>, picks an amount and sees the fee, total deduction and date before confirming.</w:t>
             </w:r>
           </w:p>
         </w:tc>
@@ -3004,12 +3227,6 @@
         </w:tc>
       </w:tr>
       <w:tr>
-        <w:tblPrEx>
-          <w:tblCellMar>
-            <w:top w:w="0" w:type="dxa"/>
-            <w:bottom w:w="0" w:type="dxa"/>
-          </w:tblCellMar>
-        </w:tblPrEx>
         <w:tc>
           <w:tcPr>
             <w:tcW w:w="1500" w:type="dxa"/>
@@ -3102,12 +3319,6 @@
         </w:tc>
       </w:tr>
       <w:tr>
-        <w:tblPrEx>
-          <w:tblCellMar>
-            <w:top w:w="0" w:type="dxa"/>
-            <w:bottom w:w="0" w:type="dxa"/>
-          </w:tblCellMar>
-        </w:tblPrEx>
         <w:tc>
           <w:tcPr>
             <w:tcW w:w="1500" w:type="dxa"/>
@@ -3164,21 +3375,23 @@
                 <w:sz w:val="19"/>
                 <w:szCs w:val="19"/>
               </w:rPr>
-              <w:t xml:space="preserve">The money lands in the upay wallet; the flat </w:t>
-            </w:r>
-            <w:r>
-              <w:rPr>
-                <w:sz w:val="19"/>
-                <w:szCs w:val="19"/>
-              </w:rPr>
-              <w:t>৳</w:t>
-            </w:r>
-            <w:r>
-              <w:rPr>
-                <w:sz w:val="19"/>
-                <w:szCs w:val="19"/>
-              </w:rPr>
-              <w:t>25 fee stays inside earned wages; no interest.</w:t>
+              <w:t xml:space="preserve">The money lands in the </w:t>
+            </w:r>
+            <w:proofErr w:type="spellStart"/>
+            <w:r>
+              <w:rPr>
+                <w:sz w:val="19"/>
+                <w:szCs w:val="19"/>
+              </w:rPr>
+              <w:t>upay</w:t>
+            </w:r>
+            <w:proofErr w:type="spellEnd"/>
+            <w:r>
+              <w:rPr>
+                <w:sz w:val="19"/>
+                <w:szCs w:val="19"/>
+              </w:rPr>
+              <w:t xml:space="preserve"> wallet; the flat ৳25 fee stays inside earned wages; no interest.</w:t>
             </w:r>
           </w:p>
         </w:tc>
@@ -3203,6 +3416,7 @@
             <w:pPr>
               <w:spacing w:line="252" w:lineRule="auto"/>
             </w:pPr>
+            <w:proofErr w:type="spellStart"/>
             <w:r>
               <w:rPr>
                 <w:sz w:val="19"/>
@@ -3210,16 +3424,11 @@
               </w:rPr>
               <w:t>upay</w:t>
             </w:r>
+            <w:proofErr w:type="spellEnd"/>
           </w:p>
         </w:tc>
       </w:tr>
       <w:tr>
-        <w:tblPrEx>
-          <w:tblCellMar>
-            <w:top w:w="0" w:type="dxa"/>
-            <w:bottom w:w="0" w:type="dxa"/>
-          </w:tblCellMar>
-        </w:tblPrEx>
         <w:tc>
           <w:tcPr>
             <w:tcW w:w="1500" w:type="dxa"/>
@@ -3306,8 +3515,17 @@
                 <w:sz w:val="19"/>
                 <w:szCs w:val="19"/>
               </w:rPr>
-              <w:t>Employer, upay</w:t>
-            </w:r>
+              <w:t xml:space="preserve">Employer, </w:t>
+            </w:r>
+            <w:proofErr w:type="spellStart"/>
+            <w:r>
+              <w:rPr>
+                <w:sz w:val="19"/>
+                <w:szCs w:val="19"/>
+              </w:rPr>
+              <w:t>upay</w:t>
+            </w:r>
+            <w:proofErr w:type="spellEnd"/>
           </w:p>
         </w:tc>
       </w:tr>
@@ -3329,7 +3547,15 @@
         <w:t xml:space="preserve">Design principle. </w:t>
       </w:r>
       <w:r>
-        <w:t>Only published rules can decline a request (tenure, monthly count, cooling-off, employer status, kill switch). Models can only shrink an offer or send it to a human; the LLM only words the result. The hard cap is min(20% of salary, earned wages − amount already owed), so a worker can never owe more than they have earned.</w:t>
+        <w:t xml:space="preserve">Only published rules can decline a request (tenure, monthly count, cooling-off, employer status, kill switch). Models can only shrink an offer or send it to a human; the LLM only words the result. The hard cap is </w:t>
+      </w:r>
+      <w:proofErr w:type="gramStart"/>
+      <w:r>
+        <w:t>min(</w:t>
+      </w:r>
+      <w:proofErr w:type="gramEnd"/>
+      <w:r>
+        <w:t>20% of salary, earned wages − amount already owed), so a worker can never owe more than they have earned.</w:t>
       </w:r>
     </w:p>
     <w:p>
@@ -3389,12 +3615,6 @@
         <w:gridCol w:w="1704"/>
       </w:tblGrid>
       <w:tr>
-        <w:tblPrEx>
-          <w:tblCellMar>
-            <w:top w:w="0" w:type="dxa"/>
-            <w:bottom w:w="0" w:type="dxa"/>
-          </w:tblCellMar>
-        </w:tblPrEx>
         <w:tc>
           <w:tcPr>
             <w:tcW w:w="1703" w:type="dxa"/>
@@ -3688,7 +3908,29 @@
           <w:sz w:val="18"/>
           <w:szCs w:val="18"/>
         </w:rPr>
-        <w:t>Figure 1. Data flow from the synthetic world to the worker's wallet</w:t>
+        <w:t xml:space="preserve">Figure 1. Data </w:t>
+      </w:r>
+      <w:proofErr w:type="gramStart"/>
+      <w:r>
+        <w:rPr>
+          <w:i/>
+          <w:iCs/>
+          <w:color w:val="5B6B73"/>
+          <w:sz w:val="18"/>
+          <w:szCs w:val="18"/>
+        </w:rPr>
+        <w:t>flow</w:t>
+      </w:r>
+      <w:proofErr w:type="gramEnd"/>
+      <w:r>
+        <w:rPr>
+          <w:i/>
+          <w:iCs/>
+          <w:color w:val="5B6B73"/>
+          <w:sz w:val="18"/>
+          <w:szCs w:val="18"/>
+        </w:rPr>
+        <w:t xml:space="preserve"> from the synthetic world to the worker's wallet</w:t>
       </w:r>
     </w:p>
     <w:tbl>
@@ -3713,12 +3955,6 @@
         <w:gridCol w:w="7838"/>
       </w:tblGrid>
       <w:tr>
-        <w:tblPrEx>
-          <w:tblCellMar>
-            <w:top w:w="0" w:type="dxa"/>
-            <w:bottom w:w="0" w:type="dxa"/>
-          </w:tblCellMar>
-        </w:tblPrEx>
         <w:trPr>
           <w:tblHeader/>
         </w:trPr>
@@ -3792,12 +4028,6 @@
         </w:tc>
       </w:tr>
       <w:tr>
-        <w:tblPrEx>
-          <w:tblCellMar>
-            <w:top w:w="0" w:type="dxa"/>
-            <w:bottom w:w="0" w:type="dxa"/>
-          </w:tblCellMar>
-        </w:tblPrEx>
         <w:tc>
           <w:tcPr>
             <w:tcW w:w="1800" w:type="dxa"/>
@@ -3860,12 +4090,6 @@
         </w:tc>
       </w:tr>
       <w:tr>
-        <w:tblPrEx>
-          <w:tblCellMar>
-            <w:top w:w="0" w:type="dxa"/>
-            <w:bottom w:w="0" w:type="dxa"/>
-          </w:tblCellMar>
-        </w:tblPrEx>
         <w:tc>
           <w:tcPr>
             <w:tcW w:w="1800" w:type="dxa"/>
@@ -3919,23 +4143,51 @@
             <w:pPr>
               <w:spacing w:line="252" w:lineRule="auto"/>
             </w:pPr>
-            <w:r>
-              <w:rPr>
-                <w:sz w:val="19"/>
-                <w:szCs w:val="19"/>
-              </w:rPr>
-              <w:t>LightGBM classifiers with calibration and SHAP reasons, quantile LightGBM with conformal intervals, IsolationForest</w:t>
-            </w:r>
+            <w:proofErr w:type="spellStart"/>
+            <w:r>
+              <w:rPr>
+                <w:sz w:val="19"/>
+                <w:szCs w:val="19"/>
+              </w:rPr>
+              <w:t>LightGBM</w:t>
+            </w:r>
+            <w:proofErr w:type="spellEnd"/>
+            <w:r>
+              <w:rPr>
+                <w:sz w:val="19"/>
+                <w:szCs w:val="19"/>
+              </w:rPr>
+              <w:t xml:space="preserve"> classifiers with calibration and SHAP reasons, quantile </w:t>
+            </w:r>
+            <w:proofErr w:type="spellStart"/>
+            <w:r>
+              <w:rPr>
+                <w:sz w:val="19"/>
+                <w:szCs w:val="19"/>
+              </w:rPr>
+              <w:t>LightGBM</w:t>
+            </w:r>
+            <w:proofErr w:type="spellEnd"/>
+            <w:r>
+              <w:rPr>
+                <w:sz w:val="19"/>
+                <w:szCs w:val="19"/>
+              </w:rPr>
+              <w:t xml:space="preserve"> with conformal intervals, </w:t>
+            </w:r>
+            <w:proofErr w:type="spellStart"/>
+            <w:r>
+              <w:rPr>
+                <w:sz w:val="19"/>
+                <w:szCs w:val="19"/>
+              </w:rPr>
+              <w:t>IsolationForest</w:t>
+            </w:r>
+            <w:proofErr w:type="spellEnd"/>
           </w:p>
         </w:tc>
       </w:tr>
       <w:tr>
-        <w:tblPrEx>
-          <w:tblCellMar>
-            <w:top w:w="0" w:type="dxa"/>
-            <w:bottom w:w="0" w:type="dxa"/>
-          </w:tblCellMar>
-        </w:tblPrEx>
         <w:tc>
           <w:tcPr>
             <w:tcW w:w="1800" w:type="dxa"/>
@@ -3998,12 +4250,6 @@
         </w:tc>
       </w:tr>
       <w:tr>
-        <w:tblPrEx>
-          <w:tblCellMar>
-            <w:top w:w="0" w:type="dxa"/>
-            <w:bottom w:w="0" w:type="dxa"/>
-          </w:tblCellMar>
-        </w:tblPrEx>
         <w:tc>
           <w:tcPr>
             <w:tcW w:w="1800" w:type="dxa"/>
@@ -4057,23 +4303,26 @@
             <w:pPr>
               <w:spacing w:line="252" w:lineRule="auto"/>
             </w:pPr>
-            <w:r>
-              <w:rPr>
-                <w:sz w:val="19"/>
-                <w:szCs w:val="19"/>
-              </w:rPr>
-              <w:t>FastAPI with typed schemas; per-session simulation sandbox keyed by X-Session-Id; CORS allow-list; /health</w:t>
+            <w:proofErr w:type="spellStart"/>
+            <w:r>
+              <w:rPr>
+                <w:sz w:val="19"/>
+                <w:szCs w:val="19"/>
+              </w:rPr>
+              <w:t>FastAPI</w:t>
+            </w:r>
+            <w:proofErr w:type="spellEnd"/>
+            <w:r>
+              <w:rPr>
+                <w:sz w:val="19"/>
+                <w:szCs w:val="19"/>
+              </w:rPr>
+              <w:t xml:space="preserve"> with typed schemas; per-session simulation sandbox keyed by X-Session-Id; CORS allow-list; /health</w:t>
             </w:r>
           </w:p>
         </w:tc>
       </w:tr>
       <w:tr>
-        <w:tblPrEx>
-          <w:tblCellMar>
-            <w:top w:w="0" w:type="dxa"/>
-            <w:bottom w:w="0" w:type="dxa"/>
-          </w:tblCellMar>
-        </w:tblPrEx>
         <w:tc>
           <w:tcPr>
             <w:tcW w:w="1800" w:type="dxa"/>
@@ -4136,12 +4385,6 @@
         </w:tc>
       </w:tr>
       <w:tr>
-        <w:tblPrEx>
-          <w:tblCellMar>
-            <w:top w:w="0" w:type="dxa"/>
-            <w:bottom w:w="0" w:type="dxa"/>
-          </w:tblCellMar>
-        </w:tblPrEx>
         <w:tc>
           <w:tcPr>
             <w:tcW w:w="1800" w:type="dxa"/>
@@ -4206,12 +4449,6 @@
         </w:tc>
       </w:tr>
       <w:tr>
-        <w:tblPrEx>
-          <w:tblCellMar>
-            <w:top w:w="0" w:type="dxa"/>
-            <w:bottom w:w="0" w:type="dxa"/>
-          </w:tblCellMar>
-        </w:tblPrEx>
         <w:tc>
           <w:tcPr>
             <w:tcW w:w="1800" w:type="dxa"/>
@@ -4268,8 +4505,17 @@
                 <w:sz w:val="19"/>
                 <w:szCs w:val="19"/>
               </w:rPr>
-              <w:t>API on Render, frontend on Vercel</w:t>
-            </w:r>
+              <w:t xml:space="preserve">API on Render, frontend on </w:t>
+            </w:r>
+            <w:proofErr w:type="spellStart"/>
+            <w:r>
+              <w:rPr>
+                <w:sz w:val="19"/>
+                <w:szCs w:val="19"/>
+              </w:rPr>
+              <w:t>Vercel</w:t>
+            </w:r>
+            <w:proofErr w:type="spellEnd"/>
           </w:p>
         </w:tc>
       </w:tr>
@@ -4328,12 +4574,6 @@
         <w:gridCol w:w="3213"/>
       </w:tblGrid>
       <w:tr>
-        <w:tblPrEx>
-          <w:tblCellMar>
-            <w:top w:w="0" w:type="dxa"/>
-            <w:bottom w:w="0" w:type="dxa"/>
-          </w:tblCellMar>
-        </w:tblPrEx>
         <w:tc>
           <w:tcPr>
             <w:tcW w:w="3212" w:type="dxa"/>
@@ -4357,65 +4597,6 @@
                   <wp:extent cx="1666875" cy="3295650"/>
                   <wp:effectExtent l="0" t="0" r="0" b="0"/>
                   <wp:docPr id="1" name="employee-home.png" descr="employee-home.png" title="employee-home.png"/>
-                  <wp:cNvGraphicFramePr>
-                    <a:graphicFrameLocks xmlns:a="http://schemas.openxmlformats.org/drawingml/2006/main" noChangeAspect="1"/>
-                  </wp:cNvGraphicFramePr>
-                  <a:graphic xmlns:a="http://schemas.openxmlformats.org/drawingml/2006/main">
-                    <a:graphicData uri="http://schemas.openxmlformats.org/drawingml/2006/picture">
-                      <pic:pic xmlns:pic="http://schemas.openxmlformats.org/drawingml/2006/picture">
-                        <pic:nvPicPr>
-                          <pic:cNvPr id="0" name=""/>
-                          <pic:cNvPicPr>
-                            <a:picLocks noChangeAspect="1" noChangeArrowheads="1"/>
-                          </pic:cNvPicPr>
-                        </pic:nvPicPr>
-                        <pic:blipFill>
-                          <a:blip r:embed="rId9"/>
-                          <a:srcRect/>
-                          <a:stretch>
-                            <a:fillRect/>
-                          </a:stretch>
-                        </pic:blipFill>
-                        <pic:spPr bwMode="auto">
-                          <a:xfrm>
-                            <a:off x="0" y="0"/>
-                            <a:ext cx="1666875" cy="3295650"/>
-                          </a:xfrm>
-                          <a:prstGeom prst="rect">
-                            <a:avLst/>
-                          </a:prstGeom>
-                        </pic:spPr>
-                      </pic:pic>
-                    </a:graphicData>
-                  </a:graphic>
-                </wp:inline>
-              </w:drawing>
-            </w:r>
-          </w:p>
-        </w:tc>
-        <w:tc>
-          <w:tcPr>
-            <w:tcW w:w="3212" w:type="dxa"/>
-            <w:tcBorders>
-              <w:top w:val="none" w:sz="0" w:space="0" w:color="FFFFFF"/>
-              <w:left w:val="none" w:sz="0" w:space="0" w:color="FFFFFF"/>
-              <w:bottom w:val="none" w:sz="0" w:space="0" w:color="FFFFFF"/>
-              <w:right w:val="none" w:sz="0" w:space="0" w:color="FFFFFF"/>
-            </w:tcBorders>
-          </w:tcPr>
-          <w:p>
-            <w:pPr>
-              <w:jc w:val="center"/>
-            </w:pPr>
-            <w:r>
-              <w:rPr>
-                <w:noProof/>
-              </w:rPr>
-              <w:drawing>
-                <wp:inline distT="0" distB="0" distL="0" distR="0" wp14:anchorId="02E8FC9E" wp14:editId="3F2FDF8A">
-                  <wp:extent cx="1666875" cy="3295650"/>
-                  <wp:effectExtent l="0" t="0" r="0" b="0"/>
-                  <wp:docPr id="2" name="employee-offer.png" descr="employee-offer.png" title="employee-offer.png"/>
                   <wp:cNvGraphicFramePr>
                     <a:graphicFrameLocks xmlns:a="http://schemas.openxmlformats.org/drawingml/2006/main" noChangeAspect="1"/>
                   </wp:cNvGraphicFramePr>
@@ -4471,10 +4652,10 @@
                 <w:noProof/>
               </w:rPr>
               <w:drawing>
-                <wp:inline distT="0" distB="0" distL="0" distR="0" wp14:anchorId="2A9F7612" wp14:editId="42815F37">
+                <wp:inline distT="0" distB="0" distL="0" distR="0" wp14:anchorId="02E8FC9E" wp14:editId="3F2FDF8A">
                   <wp:extent cx="1666875" cy="3295650"/>
                   <wp:effectExtent l="0" t="0" r="0" b="0"/>
-                  <wp:docPr id="3" name="employee-offer-bn.png" descr="employee-offer-bn.png" title="employee-offer-bn.png"/>
+                  <wp:docPr id="2" name="employee-offer.png" descr="employee-offer.png" title="employee-offer.png"/>
                   <wp:cNvGraphicFramePr>
                     <a:graphicFrameLocks xmlns:a="http://schemas.openxmlformats.org/drawingml/2006/main" noChangeAspect="1"/>
                   </wp:cNvGraphicFramePr>
@@ -4511,14 +4692,67 @@
             </w:r>
           </w:p>
         </w:tc>
+        <w:tc>
+          <w:tcPr>
+            <w:tcW w:w="3212" w:type="dxa"/>
+            <w:tcBorders>
+              <w:top w:val="none" w:sz="0" w:space="0" w:color="FFFFFF"/>
+              <w:left w:val="none" w:sz="0" w:space="0" w:color="FFFFFF"/>
+              <w:bottom w:val="none" w:sz="0" w:space="0" w:color="FFFFFF"/>
+              <w:right w:val="none" w:sz="0" w:space="0" w:color="FFFFFF"/>
+            </w:tcBorders>
+          </w:tcPr>
+          <w:p>
+            <w:pPr>
+              <w:jc w:val="center"/>
+            </w:pPr>
+            <w:r>
+              <w:rPr>
+                <w:noProof/>
+              </w:rPr>
+              <w:drawing>
+                <wp:inline distT="0" distB="0" distL="0" distR="0" wp14:anchorId="2A9F7612" wp14:editId="42815F37">
+                  <wp:extent cx="1666875" cy="3295650"/>
+                  <wp:effectExtent l="0" t="0" r="0" b="0"/>
+                  <wp:docPr id="3" name="employee-offer-bn.png" descr="employee-offer-bn.png" title="employee-offer-bn.png"/>
+                  <wp:cNvGraphicFramePr>
+                    <a:graphicFrameLocks xmlns:a="http://schemas.openxmlformats.org/drawingml/2006/main" noChangeAspect="1"/>
+                  </wp:cNvGraphicFramePr>
+                  <a:graphic xmlns:a="http://schemas.openxmlformats.org/drawingml/2006/main">
+                    <a:graphicData uri="http://schemas.openxmlformats.org/drawingml/2006/picture">
+                      <pic:pic xmlns:pic="http://schemas.openxmlformats.org/drawingml/2006/picture">
+                        <pic:nvPicPr>
+                          <pic:cNvPr id="0" name=""/>
+                          <pic:cNvPicPr>
+                            <a:picLocks noChangeAspect="1" noChangeArrowheads="1"/>
+                          </pic:cNvPicPr>
+                        </pic:nvPicPr>
+                        <pic:blipFill>
+                          <a:blip r:embed="rId12"/>
+                          <a:srcRect/>
+                          <a:stretch>
+                            <a:fillRect/>
+                          </a:stretch>
+                        </pic:blipFill>
+                        <pic:spPr bwMode="auto">
+                          <a:xfrm>
+                            <a:off x="0" y="0"/>
+                            <a:ext cx="1666875" cy="3295650"/>
+                          </a:xfrm>
+                          <a:prstGeom prst="rect">
+                            <a:avLst/>
+                          </a:prstGeom>
+                        </pic:spPr>
+                      </pic:pic>
+                    </a:graphicData>
+                  </a:graphic>
+                </wp:inline>
+              </w:drawing>
+            </w:r>
+          </w:p>
+        </w:tc>
       </w:tr>
       <w:tr>
-        <w:tblPrEx>
-          <w:tblCellMar>
-            <w:top w:w="0" w:type="dxa"/>
-            <w:bottom w:w="0" w:type="dxa"/>
-          </w:tblCellMar>
-        </w:tblPrEx>
         <w:tc>
           <w:tcPr>
             <w:tcW w:w="3212" w:type="dxa"/>
@@ -4627,7 +4861,23 @@
           <w:b/>
           <w:bCs/>
         </w:rPr>
-        <w:t xml:space="preserve">Employer HR and upay operations. </w:t>
+        <w:t xml:space="preserve">Employer HR and </w:t>
+      </w:r>
+      <w:proofErr w:type="spellStart"/>
+      <w:r>
+        <w:rPr>
+          <w:b/>
+          <w:bCs/>
+        </w:rPr>
+        <w:t>upay</w:t>
+      </w:r>
+      <w:proofErr w:type="spellEnd"/>
+      <w:r>
+        <w:rPr>
+          <w:b/>
+          <w:bCs/>
+        </w:rPr>
+        <w:t xml:space="preserve"> operations. </w:t>
       </w:r>
       <w:r>
         <w:t>HR gets a deduction notice and CSV and confirms one remittance. Operations sees outstanding advances, the capital forecast, the human approval queue, the kill switch, employer risk and the borrowing monitor.</w:t>
@@ -4647,72 +4897,6 @@
             <wp:extent cx="5715000" cy="3571875"/>
             <wp:effectExtent l="0" t="0" r="0" b="0"/>
             <wp:docPr id="4" name="employer-hr.png" descr="employer-hr.png" title="employer-hr.png"/>
-            <wp:cNvGraphicFramePr>
-              <a:graphicFrameLocks xmlns:a="http://schemas.openxmlformats.org/drawingml/2006/main" noChangeAspect="1"/>
-            </wp:cNvGraphicFramePr>
-            <a:graphic xmlns:a="http://schemas.openxmlformats.org/drawingml/2006/main">
-              <a:graphicData uri="http://schemas.openxmlformats.org/drawingml/2006/picture">
-                <pic:pic xmlns:pic="http://schemas.openxmlformats.org/drawingml/2006/picture">
-                  <pic:nvPicPr>
-                    <pic:cNvPr id="0" name=""/>
-                    <pic:cNvPicPr>
-                      <a:picLocks noChangeAspect="1" noChangeArrowheads="1"/>
-                    </pic:cNvPicPr>
-                  </pic:nvPicPr>
-                  <pic:blipFill>
-                    <a:blip r:embed="rId12"/>
-                    <a:srcRect/>
-                    <a:stretch>
-                      <a:fillRect/>
-                    </a:stretch>
-                  </pic:blipFill>
-                  <pic:spPr bwMode="auto">
-                    <a:xfrm>
-                      <a:off x="0" y="0"/>
-                      <a:ext cx="5715000" cy="3571875"/>
-                    </a:xfrm>
-                    <a:prstGeom prst="rect">
-                      <a:avLst/>
-                    </a:prstGeom>
-                  </pic:spPr>
-                </pic:pic>
-              </a:graphicData>
-            </a:graphic>
-          </wp:inline>
-        </w:drawing>
-      </w:r>
-    </w:p>
-    <w:p>
-      <w:pPr>
-        <w:spacing w:after="200"/>
-        <w:jc w:val="center"/>
-      </w:pPr>
-      <w:r>
-        <w:rPr>
-          <w:i/>
-          <w:iCs/>
-          <w:color w:val="5B6B73"/>
-          <w:sz w:val="18"/>
-          <w:szCs w:val="18"/>
-        </w:rPr>
-        <w:t>Figure 3. Employer HR: one deduction list and one remittance</w:t>
-      </w:r>
-    </w:p>
-    <w:p>
-      <w:pPr>
-        <w:spacing w:after="60"/>
-        <w:jc w:val="center"/>
-      </w:pPr>
-      <w:r>
-        <w:rPr>
-          <w:noProof/>
-        </w:rPr>
-        <w:lastRenderedPageBreak/>
-        <w:drawing>
-          <wp:inline distT="0" distB="0" distL="0" distR="0" wp14:anchorId="0C586949" wp14:editId="36CBD4E9">
-            <wp:extent cx="5715000" cy="3571875"/>
-            <wp:effectExtent l="0" t="0" r="0" b="0"/>
-            <wp:docPr id="5" name="ops-eid-surge.png" descr="ops-eid-surge.png" title="ops-eid-surge.png"/>
             <wp:cNvGraphicFramePr>
               <a:graphicFrameLocks xmlns:a="http://schemas.openxmlformats.org/drawingml/2006/main" noChangeAspect="1"/>
             </wp:cNvGraphicFramePr>
@@ -4761,7 +4945,95 @@
           <w:sz w:val="18"/>
           <w:szCs w:val="18"/>
         </w:rPr>
-        <w:t>Figure 4. upay operations during scenario S6 (Eid surge): the required pool rises above the pool, so new requests queue</w:t>
+        <w:t>Figure 3. Employer HR: one deduction list and one remittance</w:t>
+      </w:r>
+    </w:p>
+    <w:p>
+      <w:pPr>
+        <w:spacing w:after="60"/>
+        <w:jc w:val="center"/>
+      </w:pPr>
+      <w:r>
+        <w:rPr>
+          <w:noProof/>
+        </w:rPr>
+        <w:lastRenderedPageBreak/>
+        <w:drawing>
+          <wp:inline distT="0" distB="0" distL="0" distR="0" wp14:anchorId="0C586949" wp14:editId="36CBD4E9">
+            <wp:extent cx="5715000" cy="3571875"/>
+            <wp:effectExtent l="0" t="0" r="0" b="0"/>
+            <wp:docPr id="5" name="ops-eid-surge.png" descr="ops-eid-surge.png" title="ops-eid-surge.png"/>
+            <wp:cNvGraphicFramePr>
+              <a:graphicFrameLocks xmlns:a="http://schemas.openxmlformats.org/drawingml/2006/main" noChangeAspect="1"/>
+            </wp:cNvGraphicFramePr>
+            <a:graphic xmlns:a="http://schemas.openxmlformats.org/drawingml/2006/main">
+              <a:graphicData uri="http://schemas.openxmlformats.org/drawingml/2006/picture">
+                <pic:pic xmlns:pic="http://schemas.openxmlformats.org/drawingml/2006/picture">
+                  <pic:nvPicPr>
+                    <pic:cNvPr id="0" name=""/>
+                    <pic:cNvPicPr>
+                      <a:picLocks noChangeAspect="1" noChangeArrowheads="1"/>
+                    </pic:cNvPicPr>
+                  </pic:nvPicPr>
+                  <pic:blipFill>
+                    <a:blip r:embed="rId14"/>
+                    <a:srcRect/>
+                    <a:stretch>
+                      <a:fillRect/>
+                    </a:stretch>
+                  </pic:blipFill>
+                  <pic:spPr bwMode="auto">
+                    <a:xfrm>
+                      <a:off x="0" y="0"/>
+                      <a:ext cx="5715000" cy="3571875"/>
+                    </a:xfrm>
+                    <a:prstGeom prst="rect">
+                      <a:avLst/>
+                    </a:prstGeom>
+                  </pic:spPr>
+                </pic:pic>
+              </a:graphicData>
+            </a:graphic>
+          </wp:inline>
+        </w:drawing>
+      </w:r>
+    </w:p>
+    <w:p>
+      <w:pPr>
+        <w:spacing w:after="200"/>
+        <w:jc w:val="center"/>
+      </w:pPr>
+      <w:r>
+        <w:rPr>
+          <w:i/>
+          <w:iCs/>
+          <w:color w:val="5B6B73"/>
+          <w:sz w:val="18"/>
+          <w:szCs w:val="18"/>
+        </w:rPr>
+        <w:t xml:space="preserve">Figure 4. </w:t>
+      </w:r>
+      <w:proofErr w:type="spellStart"/>
+      <w:r>
+        <w:rPr>
+          <w:i/>
+          <w:iCs/>
+          <w:color w:val="5B6B73"/>
+          <w:sz w:val="18"/>
+          <w:szCs w:val="18"/>
+        </w:rPr>
+        <w:t>upay</w:t>
+      </w:r>
+      <w:proofErr w:type="spellEnd"/>
+      <w:r>
+        <w:rPr>
+          <w:i/>
+          <w:iCs/>
+          <w:color w:val="5B6B73"/>
+          <w:sz w:val="18"/>
+          <w:szCs w:val="18"/>
+        </w:rPr>
+        <w:t xml:space="preserve"> operations during scenario S6 (Eid surge): the required pool rises above the pool, so new requests queue</w:t>
       </w:r>
     </w:p>
     <w:p>
@@ -4809,13 +5081,15 @@
         <w:t xml:space="preserve">Earned-wage advance with a hard cap </w:t>
       </w:r>
       <w:r>
-        <w:t xml:space="preserve">of min(20% of salary, earned − owed), a minimum of </w:t>
-      </w:r>
-      <w:r>
-        <w:t>৳</w:t>
-      </w:r>
-      <w:r>
-        <w:t>500 and at most two advances a month.</w:t>
+        <w:t xml:space="preserve">of </w:t>
+      </w:r>
+      <w:proofErr w:type="gramStart"/>
+      <w:r>
+        <w:t>min(</w:t>
+      </w:r>
+      <w:proofErr w:type="gramEnd"/>
+      <w:r>
+        <w:t>20% of salary, earned − owed), a minimum of ৳500 and at most two advances a month.</w:t>
       </w:r>
     </w:p>
     <w:p>
@@ -4875,7 +5149,15 @@
         <w:t xml:space="preserve">Employer deduction notice </w:t>
       </w:r>
       <w:r>
-        <w:t>with CSV export and one-click remittance confirmation; HR can lower the limit or switch the programme off.</w:t>
+        <w:t xml:space="preserve">with CSV export and one-click remittance confirmation; HR can lower the limit or switch the </w:t>
+      </w:r>
+      <w:proofErr w:type="spellStart"/>
+      <w:r>
+        <w:t>programme</w:t>
+      </w:r>
+      <w:proofErr w:type="spellEnd"/>
+      <w:r>
+        <w:t xml:space="preserve"> off.</w:t>
       </w:r>
     </w:p>
     <w:p>
@@ -4915,13 +5197,7 @@
         <w:t xml:space="preserve">Human approval queue </w:t>
       </w:r>
       <w:r>
-        <w:t xml:space="preserve">for amounts of </w:t>
-      </w:r>
-      <w:r>
-        <w:t>৳</w:t>
-      </w:r>
-      <w:r>
-        <w:t>10,000 or more, tier D and anomaly-flagged requests; a kill switch pauses all new advances.</w:t>
+        <w:t>for amounts of ৳10,000 or more, tier D and anomaly-flagged requests; a kill switch pauses all new advances.</w:t>
       </w:r>
     </w:p>
     <w:p>
@@ -5010,10 +5286,15 @@
         <w:spacing w:after="120" w:line="276" w:lineRule="auto"/>
       </w:pPr>
       <w:r>
-        <w:t>No production data is needed. A seeded generator builds a synthetic world (Profile A) with known patterns: employers that pay late or default, workers who resign, Eid surges in demand, chronic borrowers and abusers. A harsher Profile B is used only as a stress test. Every model is trained on Profile A and evaluated on the last three months, which are never used for training, across five seeds (42, 1042, 2042, 3042, 4042). Features are computed only from data strictly before each decision date, and leakage t</w:t>
-      </w:r>
-      <w:r>
-        <w:t>ests guard this. Gender and region are kept out of every model and used only for the fairness audit.</w:t>
+        <w:t xml:space="preserve">No production data is needed. A seeded generator builds a synthetic world (Profile A) with known patterns: employers that pay late or default, workers who resign, Eid surges in demand, chronic borrowers and abusers. A harsher Profile B is used only as a stress test. Every model is trained on Profile A and evaluated </w:t>
+      </w:r>
+      <w:proofErr w:type="gramStart"/>
+      <w:r>
+        <w:t>on</w:t>
+      </w:r>
+      <w:proofErr w:type="gramEnd"/>
+      <w:r>
+        <w:t xml:space="preserve"> the last three months, which are never used for training, across five seeds (42, 1042, 2042, 3042, 4042). Features are computed only from data strictly before each decision date, and leakage tests guard this. Gender and region are kept out of every model and used only for the fairness audit.</w:t>
       </w:r>
     </w:p>
     <w:p>
@@ -5050,12 +5331,6 @@
         <w:gridCol w:w="3338"/>
       </w:tblGrid>
       <w:tr>
-        <w:tblPrEx>
-          <w:tblCellMar>
-            <w:top w:w="0" w:type="dxa"/>
-            <w:bottom w:w="0" w:type="dxa"/>
-          </w:tblCellMar>
-        </w:tblPrEx>
         <w:trPr>
           <w:tblHeader/>
         </w:trPr>
@@ -5197,12 +5472,6 @@
         </w:tc>
       </w:tr>
       <w:tr>
-        <w:tblPrEx>
-          <w:tblCellMar>
-            <w:top w:w="0" w:type="dxa"/>
-            <w:bottom w:w="0" w:type="dxa"/>
-          </w:tblCellMar>
-        </w:tblPrEx>
         <w:tc>
           <w:tcPr>
             <w:tcW w:w="800" w:type="dxa"/>
@@ -5284,12 +5553,21 @@
             <w:pPr>
               <w:spacing w:line="252" w:lineRule="auto"/>
             </w:pPr>
-            <w:r>
-              <w:rPr>
-                <w:sz w:val="19"/>
-                <w:szCs w:val="19"/>
-              </w:rPr>
-              <w:t>LightGBM + calibration, SHAP</w:t>
+            <w:proofErr w:type="spellStart"/>
+            <w:r>
+              <w:rPr>
+                <w:sz w:val="19"/>
+                <w:szCs w:val="19"/>
+              </w:rPr>
+              <w:t>LightGBM</w:t>
+            </w:r>
+            <w:proofErr w:type="spellEnd"/>
+            <w:r>
+              <w:rPr>
+                <w:sz w:val="19"/>
+                <w:szCs w:val="19"/>
+              </w:rPr>
+              <w:t xml:space="preserve"> + calibration, SHAP</w:t>
             </w:r>
           </w:p>
         </w:tc>
@@ -5325,12 +5603,6 @@
         </w:tc>
       </w:tr>
       <w:tr>
-        <w:tblPrEx>
-          <w:tblCellMar>
-            <w:top w:w="0" w:type="dxa"/>
-            <w:bottom w:w="0" w:type="dxa"/>
-          </w:tblCellMar>
-        </w:tblPrEx>
         <w:tc>
           <w:tcPr>
             <w:tcW w:w="800" w:type="dxa"/>
@@ -5415,12 +5687,21 @@
             <w:pPr>
               <w:spacing w:line="252" w:lineRule="auto"/>
             </w:pPr>
-            <w:r>
-              <w:rPr>
-                <w:sz w:val="19"/>
-                <w:szCs w:val="19"/>
-              </w:rPr>
-              <w:t>LightGBM + calibration, SHAP → tier A/B/C/D</w:t>
+            <w:proofErr w:type="spellStart"/>
+            <w:r>
+              <w:rPr>
+                <w:sz w:val="19"/>
+                <w:szCs w:val="19"/>
+              </w:rPr>
+              <w:t>LightGBM</w:t>
+            </w:r>
+            <w:proofErr w:type="spellEnd"/>
+            <w:r>
+              <w:rPr>
+                <w:sz w:val="19"/>
+                <w:szCs w:val="19"/>
+              </w:rPr>
+              <w:t xml:space="preserve"> + calibration, SHAP → tier A/B/C/D</w:t>
             </w:r>
           </w:p>
         </w:tc>
@@ -5457,12 +5738,6 @@
         </w:tc>
       </w:tr>
       <w:tr>
-        <w:tblPrEx>
-          <w:tblCellMar>
-            <w:top w:w="0" w:type="dxa"/>
-            <w:bottom w:w="0" w:type="dxa"/>
-          </w:tblCellMar>
-        </w:tblPrEx>
         <w:tc>
           <w:tcPr>
             <w:tcW w:w="800" w:type="dxa"/>
@@ -5544,12 +5819,21 @@
             <w:pPr>
               <w:spacing w:line="252" w:lineRule="auto"/>
             </w:pPr>
-            <w:r>
-              <w:rPr>
-                <w:sz w:val="19"/>
-                <w:szCs w:val="19"/>
-              </w:rPr>
-              <w:t>LightGBM + calibration</w:t>
+            <w:proofErr w:type="spellStart"/>
+            <w:r>
+              <w:rPr>
+                <w:sz w:val="19"/>
+                <w:szCs w:val="19"/>
+              </w:rPr>
+              <w:t>LightGBM</w:t>
+            </w:r>
+            <w:proofErr w:type="spellEnd"/>
+            <w:r>
+              <w:rPr>
+                <w:sz w:val="19"/>
+                <w:szCs w:val="19"/>
+              </w:rPr>
+              <w:t xml:space="preserve"> + calibration</w:t>
             </w:r>
           </w:p>
         </w:tc>
@@ -5585,12 +5869,6 @@
         </w:tc>
       </w:tr>
       <w:tr>
-        <w:tblPrEx>
-          <w:tblCellMar>
-            <w:top w:w="0" w:type="dxa"/>
-            <w:bottom w:w="0" w:type="dxa"/>
-          </w:tblCellMar>
-        </w:tblPrEx>
         <w:tc>
           <w:tcPr>
             <w:tcW w:w="800" w:type="dxa"/>
@@ -5649,7 +5927,23 @@
                 <w:sz w:val="19"/>
                 <w:szCs w:val="19"/>
               </w:rPr>
-              <w:t>How much money will be advanced next month?</w:t>
+              <w:t xml:space="preserve">How much money will be </w:t>
+            </w:r>
+            <w:proofErr w:type="gramStart"/>
+            <w:r>
+              <w:rPr>
+                <w:sz w:val="19"/>
+                <w:szCs w:val="19"/>
+              </w:rPr>
+              <w:t>advanced</w:t>
+            </w:r>
+            <w:proofErr w:type="gramEnd"/>
+            <w:r>
+              <w:rPr>
+                <w:sz w:val="19"/>
+                <w:szCs w:val="19"/>
+              </w:rPr>
+              <w:t xml:space="preserve"> next month?</w:t>
             </w:r>
           </w:p>
         </w:tc>
@@ -5680,7 +5974,23 @@
                 <w:sz w:val="19"/>
                 <w:szCs w:val="19"/>
               </w:rPr>
-              <w:t>Quantile LightGBM + split conformal</w:t>
+              <w:t xml:space="preserve">Quantile </w:t>
+            </w:r>
+            <w:proofErr w:type="spellStart"/>
+            <w:r>
+              <w:rPr>
+                <w:sz w:val="19"/>
+                <w:szCs w:val="19"/>
+              </w:rPr>
+              <w:t>LightGBM</w:t>
+            </w:r>
+            <w:proofErr w:type="spellEnd"/>
+            <w:r>
+              <w:rPr>
+                <w:sz w:val="19"/>
+                <w:szCs w:val="19"/>
+              </w:rPr>
+              <w:t xml:space="preserve"> + split conformal</w:t>
             </w:r>
           </w:p>
         </w:tc>
@@ -5717,12 +6027,6 @@
         </w:tc>
       </w:tr>
       <w:tr>
-        <w:tblPrEx>
-          <w:tblCellMar>
-            <w:top w:w="0" w:type="dxa"/>
-            <w:bottom w:w="0" w:type="dxa"/>
-          </w:tblCellMar>
-        </w:tblPrEx>
         <w:tc>
           <w:tcPr>
             <w:tcW w:w="800" w:type="dxa"/>
@@ -5804,12 +6108,21 @@
             <w:pPr>
               <w:spacing w:line="252" w:lineRule="auto"/>
             </w:pPr>
-            <w:r>
-              <w:rPr>
-                <w:sz w:val="19"/>
-                <w:szCs w:val="19"/>
-              </w:rPr>
-              <w:t>IsolationForest, top 2% to a person</w:t>
+            <w:proofErr w:type="spellStart"/>
+            <w:r>
+              <w:rPr>
+                <w:sz w:val="19"/>
+                <w:szCs w:val="19"/>
+              </w:rPr>
+              <w:t>IsolationForest</w:t>
+            </w:r>
+            <w:proofErr w:type="spellEnd"/>
+            <w:r>
+              <w:rPr>
+                <w:sz w:val="19"/>
+                <w:szCs w:val="19"/>
+              </w:rPr>
+              <w:t>, top 2% to a person</w:t>
             </w:r>
           </w:p>
         </w:tc>
@@ -5883,7 +6196,15 @@
         <w:spacing w:after="60" w:line="264" w:lineRule="auto"/>
       </w:pPr>
       <w:r>
-        <w:t>Hard cap: min(20% of salary, earned − already owed).</w:t>
+        <w:t xml:space="preserve">Hard cap: </w:t>
+      </w:r>
+      <w:proofErr w:type="gramStart"/>
+      <w:r>
+        <w:t>min(</w:t>
+      </w:r>
+      <w:proofErr w:type="gramEnd"/>
+      <w:r>
+        <w:t>20% of salary, earned − already owed).</w:t>
       </w:r>
     </w:p>
     <w:p>
@@ -5922,13 +6243,7 @@
         <w:spacing w:after="60" w:line="264" w:lineRule="auto"/>
       </w:pPr>
       <w:r>
-        <w:t xml:space="preserve">Human queue: </w:t>
-      </w:r>
-      <w:r>
-        <w:t>৳</w:t>
-      </w:r>
-      <w:r>
-        <w:t>10,000 or more, tier D or an M5 flag.</w:t>
+        <w:t>Human queue: ৳10,000 or more, tier D or an M5 flag.</w:t>
       </w:r>
     </w:p>
     <w:p>
@@ -6005,12 +6320,6 @@
         <w:gridCol w:w="1738"/>
       </w:tblGrid>
       <w:tr>
-        <w:tblPrEx>
-          <w:tblCellMar>
-            <w:top w:w="0" w:type="dxa"/>
-            <w:bottom w:w="0" w:type="dxa"/>
-          </w:tblCellMar>
-        </w:tblPrEx>
         <w:trPr>
           <w:tblHeader/>
         </w:trPr>
@@ -6152,12 +6461,6 @@
         </w:tc>
       </w:tr>
       <w:tr>
-        <w:tblPrEx>
-          <w:tblCellMar>
-            <w:top w:w="0" w:type="dxa"/>
-            <w:bottom w:w="0" w:type="dxa"/>
-          </w:tblCellMar>
-        </w:tblPrEx>
         <w:tc>
           <w:tcPr>
             <w:tcW w:w="1900" w:type="dxa"/>
@@ -6283,12 +6586,6 @@
         </w:tc>
       </w:tr>
       <w:tr>
-        <w:tblPrEx>
-          <w:tblCellMar>
-            <w:top w:w="0" w:type="dxa"/>
-            <w:bottom w:w="0" w:type="dxa"/>
-          </w:tblCellMar>
-        </w:tblPrEx>
         <w:tc>
           <w:tcPr>
             <w:tcW w:w="1900" w:type="dxa"/>
@@ -6418,12 +6715,6 @@
         </w:tc>
       </w:tr>
       <w:tr>
-        <w:tblPrEx>
-          <w:tblCellMar>
-            <w:top w:w="0" w:type="dxa"/>
-            <w:bottom w:w="0" w:type="dxa"/>
-          </w:tblCellMar>
-        </w:tblPrEx>
         <w:tc>
           <w:tcPr>
             <w:tcW w:w="1900" w:type="dxa"/>
@@ -6549,12 +6840,6 @@
         </w:tc>
       </w:tr>
       <w:tr>
-        <w:tblPrEx>
-          <w:tblCellMar>
-            <w:top w:w="0" w:type="dxa"/>
-            <w:bottom w:w="0" w:type="dxa"/>
-          </w:tblCellMar>
-        </w:tblPrEx>
         <w:tc>
           <w:tcPr>
             <w:tcW w:w="1900" w:type="dxa"/>
@@ -6684,12 +6969,6 @@
         </w:tc>
       </w:tr>
       <w:tr>
-        <w:tblPrEx>
-          <w:tblCellMar>
-            <w:top w:w="0" w:type="dxa"/>
-            <w:bottom w:w="0" w:type="dxa"/>
-          </w:tblCellMar>
-        </w:tblPrEx>
         <w:tc>
           <w:tcPr>
             <w:tcW w:w="1900" w:type="dxa"/>
@@ -6815,12 +7094,6 @@
         </w:tc>
       </w:tr>
       <w:tr>
-        <w:tblPrEx>
-          <w:tblCellMar>
-            <w:top w:w="0" w:type="dxa"/>
-            <w:bottom w:w="0" w:type="dxa"/>
-          </w:tblCellMar>
-        </w:tblPrEx>
         <w:tc>
           <w:tcPr>
             <w:tcW w:w="1900" w:type="dxa"/>
@@ -6950,12 +7223,6 @@
         </w:tc>
       </w:tr>
       <w:tr>
-        <w:tblPrEx>
-          <w:tblCellMar>
-            <w:top w:w="0" w:type="dxa"/>
-            <w:bottom w:w="0" w:type="dxa"/>
-          </w:tblCellMar>
-        </w:tblPrEx>
         <w:tc>
           <w:tcPr>
             <w:tcW w:w="1900" w:type="dxa"/>
@@ -7081,12 +7348,6 @@
         </w:tc>
       </w:tr>
       <w:tr>
-        <w:tblPrEx>
-          <w:tblCellMar>
-            <w:top w:w="0" w:type="dxa"/>
-            <w:bottom w:w="0" w:type="dxa"/>
-          </w:tblCellMar>
-        </w:tblPrEx>
         <w:tc>
           <w:tcPr>
             <w:tcW w:w="1900" w:type="dxa"/>
@@ -7216,12 +7477,6 @@
         </w:tc>
       </w:tr>
       <w:tr>
-        <w:tblPrEx>
-          <w:tblCellMar>
-            <w:top w:w="0" w:type="dxa"/>
-            <w:bottom w:w="0" w:type="dxa"/>
-          </w:tblCellMar>
-        </w:tblPrEx>
         <w:tc>
           <w:tcPr>
             <w:tcW w:w="1900" w:type="dxa"/>
@@ -7347,12 +7602,6 @@
         </w:tc>
       </w:tr>
       <w:tr>
-        <w:tblPrEx>
-          <w:tblCellMar>
-            <w:top w:w="0" w:type="dxa"/>
-            <w:bottom w:w="0" w:type="dxa"/>
-          </w:tblCellMar>
-        </w:tblPrEx>
         <w:tc>
           <w:tcPr>
             <w:tcW w:w="1900" w:type="dxa"/>
@@ -7411,7 +7660,23 @@
                 <w:sz w:val="19"/>
                 <w:szCs w:val="19"/>
               </w:rPr>
-              <w:t>Gap across employer size, stress world</w:t>
+              <w:t xml:space="preserve">Gap </w:t>
+            </w:r>
+            <w:proofErr w:type="gramStart"/>
+            <w:r>
+              <w:rPr>
+                <w:sz w:val="19"/>
+                <w:szCs w:val="19"/>
+              </w:rPr>
+              <w:t>across</w:t>
+            </w:r>
+            <w:proofErr w:type="gramEnd"/>
+            <w:r>
+              <w:rPr>
+                <w:sz w:val="19"/>
+                <w:szCs w:val="19"/>
+              </w:rPr>
+              <w:t xml:space="preserve"> employer size, stress world</w:t>
             </w:r>
           </w:p>
         </w:tc>
@@ -7529,7 +7794,7 @@
                     </pic:cNvPicPr>
                   </pic:nvPicPr>
                   <pic:blipFill>
-                    <a:blip r:embed="rId14"/>
+                    <a:blip r:embed="rId15"/>
                     <a:srcRect/>
                     <a:stretch>
                       <a:fillRect/>
@@ -7590,7 +7855,15 @@
         <w:t xml:space="preserve">T2-A (forecast band too wide). </w:t>
       </w:r>
       <w:r>
-        <w:t>The calibration months include synthetic Eid months, so the band is sized for a surge the test months do not have. The error is on the safe side: upay would hold more capital than needed. It was not tuned on the test result, which would make the check meaningless.</w:t>
+        <w:t xml:space="preserve">The calibration months include synthetic Eid months, so the band is sized for a surge the test months do not have. The error is on the safe side: </w:t>
+      </w:r>
+      <w:proofErr w:type="spellStart"/>
+      <w:r>
+        <w:t>upay</w:t>
+      </w:r>
+      <w:proofErr w:type="spellEnd"/>
+      <w:r>
+        <w:t xml:space="preserve"> would hold more capital than needed. It was not tuned on the test result, which would make the check meaningless.</w:t>
       </w:r>
     </w:p>
     <w:p>
@@ -7648,12 +7921,6 @@
         <w:gridCol w:w="7538"/>
       </w:tblGrid>
       <w:tr>
-        <w:tblPrEx>
-          <w:tblCellMar>
-            <w:top w:w="0" w:type="dxa"/>
-            <w:bottom w:w="0" w:type="dxa"/>
-          </w:tblCellMar>
-        </w:tblPrEx>
         <w:trPr>
           <w:tblHeader/>
         </w:trPr>
@@ -7727,12 +7994,6 @@
         </w:tc>
       </w:tr>
       <w:tr>
-        <w:tblPrEx>
-          <w:tblCellMar>
-            <w:top w:w="0" w:type="dxa"/>
-            <w:bottom w:w="0" w:type="dxa"/>
-          </w:tblCellMar>
-        </w:tblPrEx>
         <w:tc>
           <w:tcPr>
             <w:tcW w:w="2100" w:type="dxa"/>
@@ -7795,12 +8056,6 @@
         </w:tc>
       </w:tr>
       <w:tr>
-        <w:tblPrEx>
-          <w:tblCellMar>
-            <w:top w:w="0" w:type="dxa"/>
-            <w:bottom w:w="0" w:type="dxa"/>
-          </w:tblCellMar>
-        </w:tblPrEx>
         <w:tc>
           <w:tcPr>
             <w:tcW w:w="2100" w:type="dxa"/>
@@ -7865,12 +8120,6 @@
         </w:tc>
       </w:tr>
       <w:tr>
-        <w:tblPrEx>
-          <w:tblCellMar>
-            <w:top w:w="0" w:type="dxa"/>
-            <w:bottom w:w="0" w:type="dxa"/>
-          </w:tblCellMar>
-        </w:tblPrEx>
         <w:tc>
           <w:tcPr>
             <w:tcW w:w="2100" w:type="dxa"/>
@@ -7927,18 +8176,28 @@
                 <w:sz w:val="19"/>
                 <w:szCs w:val="19"/>
               </w:rPr>
-              <w:t>Gender and region are never model features; approval gaps by gender, region and employer size are audited against a 5 pp threshold, and misses are published.</w:t>
+              <w:t xml:space="preserve">Gender and region are never model features; approval gaps by gender, region and employer size are audited against a </w:t>
+            </w:r>
+            <w:proofErr w:type="gramStart"/>
+            <w:r>
+              <w:rPr>
+                <w:sz w:val="19"/>
+                <w:szCs w:val="19"/>
+              </w:rPr>
+              <w:t>5 pp</w:t>
+            </w:r>
+            <w:proofErr w:type="gramEnd"/>
+            <w:r>
+              <w:rPr>
+                <w:sz w:val="19"/>
+                <w:szCs w:val="19"/>
+              </w:rPr>
+              <w:t xml:space="preserve"> threshold, and misses are published.</w:t>
             </w:r>
           </w:p>
         </w:tc>
       </w:tr>
       <w:tr>
-        <w:tblPrEx>
-          <w:tblCellMar>
-            <w:top w:w="0" w:type="dxa"/>
-            <w:bottom w:w="0" w:type="dxa"/>
-          </w:tblCellMar>
-        </w:tblPrEx>
         <w:tc>
           <w:tcPr>
             <w:tcW w:w="2100" w:type="dxa"/>
@@ -8003,12 +8262,6 @@
         </w:tc>
       </w:tr>
       <w:tr>
-        <w:tblPrEx>
-          <w:tblCellMar>
-            <w:top w:w="0" w:type="dxa"/>
-            <w:bottom w:w="0" w:type="dxa"/>
-          </w:tblCellMar>
-        </w:tblPrEx>
         <w:tc>
           <w:tcPr>
             <w:tcW w:w="2100" w:type="dxa"/>
@@ -8065,32 +8318,28 @@
                 <w:sz w:val="19"/>
                 <w:szCs w:val="19"/>
               </w:rPr>
-              <w:t xml:space="preserve">Amounts of </w:t>
-            </w:r>
-            <w:r>
-              <w:rPr>
-                <w:sz w:val="19"/>
-                <w:szCs w:val="19"/>
-              </w:rPr>
-              <w:t>৳</w:t>
-            </w:r>
-            <w:r>
-              <w:rPr>
-                <w:sz w:val="19"/>
-                <w:szCs w:val="19"/>
-              </w:rPr>
-              <w:t>10,000 or more, tier D and anomaly-flagged requests go to a human queue; operations has a kill switch.</w:t>
+              <w:t xml:space="preserve">Amounts of ৳10,000 or more, tier D and anomaly-flagged requests go to a human queue; operations </w:t>
+            </w:r>
+            <w:proofErr w:type="gramStart"/>
+            <w:r>
+              <w:rPr>
+                <w:sz w:val="19"/>
+                <w:szCs w:val="19"/>
+              </w:rPr>
+              <w:t>has</w:t>
+            </w:r>
+            <w:proofErr w:type="gramEnd"/>
+            <w:r>
+              <w:rPr>
+                <w:sz w:val="19"/>
+                <w:szCs w:val="19"/>
+              </w:rPr>
+              <w:t xml:space="preserve"> a kill switch.</w:t>
             </w:r>
           </w:p>
         </w:tc>
       </w:tr>
       <w:tr>
-        <w:tblPrEx>
-          <w:tblCellMar>
-            <w:top w:w="0" w:type="dxa"/>
-            <w:bottom w:w="0" w:type="dxa"/>
-          </w:tblCellMar>
-        </w:tblPrEx>
         <w:tc>
           <w:tcPr>
             <w:tcW w:w="2100" w:type="dxa"/>
@@ -8155,12 +8404,6 @@
         </w:tc>
       </w:tr>
       <w:tr>
-        <w:tblPrEx>
-          <w:tblCellMar>
-            <w:top w:w="0" w:type="dxa"/>
-            <w:bottom w:w="0" w:type="dxa"/>
-          </w:tblCellMar>
-        </w:tblPrEx>
         <w:tc>
           <w:tcPr>
             <w:tcW w:w="2100" w:type="dxa"/>
@@ -8297,12 +8540,21 @@
         </w:numPr>
         <w:spacing w:after="60" w:line="264" w:lineRule="auto"/>
       </w:pPr>
+      <w:proofErr w:type="spellStart"/>
       <w:r>
         <w:rPr>
           <w:b/>
           <w:bCs/>
         </w:rPr>
-        <w:t xml:space="preserve">upay: </w:t>
+        <w:t>upay</w:t>
+      </w:r>
+      <w:proofErr w:type="spellEnd"/>
+      <w:r>
+        <w:rPr>
+          <w:b/>
+          <w:bCs/>
+        </w:rPr>
+        <w:t xml:space="preserve">: </w:t>
       </w:r>
       <w:r>
         <w:t>a new reason for monthly-paid workers to keep money in the wallet, payroll-linked inflows and fee revenue, with measured risk.</w:t>
@@ -8341,12 +8593,6 @@
         <w:gridCol w:w="4238"/>
       </w:tblGrid>
       <w:tr>
-        <w:tblPrEx>
-          <w:tblCellMar>
-            <w:top w:w="0" w:type="dxa"/>
-            <w:bottom w:w="0" w:type="dxa"/>
-          </w:tblCellMar>
-        </w:tblPrEx>
         <w:trPr>
           <w:tblHeader/>
         </w:trPr>
@@ -8455,12 +8701,6 @@
         </w:tc>
       </w:tr>
       <w:tr>
-        <w:tblPrEx>
-          <w:tblCellMar>
-            <w:top w:w="0" w:type="dxa"/>
-            <w:bottom w:w="0" w:type="dxa"/>
-          </w:tblCellMar>
-        </w:tblPrEx>
         <w:tc>
           <w:tcPr>
             <w:tcW w:w="3000" w:type="dxa"/>
@@ -8554,12 +8794,6 @@
         </w:tc>
       </w:tr>
       <w:tr>
-        <w:tblPrEx>
-          <w:tblCellMar>
-            <w:top w:w="0" w:type="dxa"/>
-            <w:bottom w:w="0" w:type="dxa"/>
-          </w:tblCellMar>
-        </w:tblPrEx>
         <w:tc>
           <w:tcPr>
             <w:tcW w:w="3000" w:type="dxa"/>
@@ -8587,21 +8821,7 @@
                 <w:sz w:val="19"/>
                 <w:szCs w:val="19"/>
               </w:rPr>
-              <w:t xml:space="preserve">Fee revenue at </w:t>
-            </w:r>
-            <w:r>
-              <w:rPr>
-                <w:sz w:val="19"/>
-                <w:szCs w:val="19"/>
-              </w:rPr>
-              <w:t>৳</w:t>
-            </w:r>
-            <w:r>
-              <w:rPr>
-                <w:sz w:val="19"/>
-                <w:szCs w:val="19"/>
-              </w:rPr>
-              <w:t>25</w:t>
+              <w:t>Fee revenue at ৳25</w:t>
             </w:r>
           </w:p>
         </w:tc>
@@ -8633,14 +8853,7 @@
                 <w:sz w:val="19"/>
                 <w:szCs w:val="19"/>
               </w:rPr>
-              <w:t>৳</w:t>
-            </w:r>
-            <w:r>
-              <w:rPr>
-                <w:sz w:val="19"/>
-                <w:szCs w:val="19"/>
-              </w:rPr>
-              <w:t>11,370</w:t>
+              <w:t>৳11,370</w:t>
             </w:r>
           </w:p>
         </w:tc>
@@ -8670,12 +8883,6 @@
         </w:tc>
       </w:tr>
       <w:tr>
-        <w:tblPrEx>
-          <w:tblCellMar>
-            <w:top w:w="0" w:type="dxa"/>
-            <w:bottom w:w="0" w:type="dxa"/>
-          </w:tblCellMar>
-        </w:tblPrEx>
         <w:tc>
           <w:tcPr>
             <w:tcW w:w="3000" w:type="dxa"/>
@@ -8733,14 +8940,7 @@
                 <w:sz w:val="19"/>
                 <w:szCs w:val="19"/>
               </w:rPr>
-              <w:t>৳</w:t>
-            </w:r>
-            <w:r>
-              <w:rPr>
-                <w:sz w:val="19"/>
-                <w:szCs w:val="19"/>
-              </w:rPr>
-              <w:t>10,248</w:t>
+              <w:t>৳10,248</w:t>
             </w:r>
           </w:p>
         </w:tc>
@@ -8776,12 +8976,6 @@
         </w:tc>
       </w:tr>
       <w:tr>
-        <w:tblPrEx>
-          <w:tblCellMar>
-            <w:top w:w="0" w:type="dxa"/>
-            <w:bottom w:w="0" w:type="dxa"/>
-          </w:tblCellMar>
-        </w:tblPrEx>
         <w:tc>
           <w:tcPr>
             <w:tcW w:w="3000" w:type="dxa"/>
@@ -8841,14 +9035,7 @@
                 <w:sz w:val="19"/>
                 <w:szCs w:val="19"/>
               </w:rPr>
-              <w:t>৳</w:t>
-            </w:r>
-            <w:r>
-              <w:rPr>
-                <w:sz w:val="19"/>
-                <w:szCs w:val="19"/>
-              </w:rPr>
-              <w:t>7,284</w:t>
+              <w:t>৳7,284</w:t>
             </w:r>
           </w:p>
         </w:tc>
@@ -8885,12 +9072,6 @@
         </w:tc>
       </w:tr>
       <w:tr>
-        <w:tblPrEx>
-          <w:tblCellMar>
-            <w:top w:w="0" w:type="dxa"/>
-            <w:bottom w:w="0" w:type="dxa"/>
-          </w:tblCellMar>
-        </w:tblPrEx>
         <w:tc>
           <w:tcPr>
             <w:tcW w:w="3000" w:type="dxa"/>
@@ -8949,14 +9130,7 @@
                 <w:sz w:val="19"/>
                 <w:szCs w:val="19"/>
               </w:rPr>
-              <w:t>৳</w:t>
-            </w:r>
-            <w:r>
-              <w:rPr>
-                <w:sz w:val="19"/>
-                <w:szCs w:val="19"/>
-              </w:rPr>
-              <w:t>2,441</w:t>
+              <w:t>৳2,441</w:t>
             </w:r>
           </w:p>
         </w:tc>
@@ -8986,18 +9160,28 @@
                 <w:sz w:val="19"/>
                 <w:szCs w:val="19"/>
               </w:rPr>
-              <w:t>15% buffer held for a month</w:t>
+              <w:t xml:space="preserve">15% </w:t>
+            </w:r>
+            <w:proofErr w:type="gramStart"/>
+            <w:r>
+              <w:rPr>
+                <w:sz w:val="19"/>
+                <w:szCs w:val="19"/>
+              </w:rPr>
+              <w:t>buffer</w:t>
+            </w:r>
+            <w:proofErr w:type="gramEnd"/>
+            <w:r>
+              <w:rPr>
+                <w:sz w:val="19"/>
+                <w:szCs w:val="19"/>
+              </w:rPr>
+              <w:t xml:space="preserve"> held for a month</w:t>
             </w:r>
           </w:p>
         </w:tc>
       </w:tr>
       <w:tr>
-        <w:tblPrEx>
-          <w:tblCellMar>
-            <w:top w:w="0" w:type="dxa"/>
-            <w:bottom w:w="0" w:type="dxa"/>
-          </w:tblCellMar>
-        </w:tblPrEx>
         <w:tc>
           <w:tcPr>
             <w:tcW w:w="3000" w:type="dxa"/>
@@ -9057,14 +9241,7 @@
                 <w:sz w:val="19"/>
                 <w:szCs w:val="19"/>
               </w:rPr>
-              <w:t>৳</w:t>
-            </w:r>
-            <w:r>
-              <w:rPr>
-                <w:sz w:val="19"/>
-                <w:szCs w:val="19"/>
-              </w:rPr>
-              <w:t>2,274</w:t>
+              <w:t>৳2,274</w:t>
             </w:r>
           </w:p>
         </w:tc>
@@ -9095,25 +9272,12 @@
                 <w:sz w:val="19"/>
                 <w:szCs w:val="19"/>
               </w:rPr>
-              <w:t>৳</w:t>
-            </w:r>
-            <w:r>
-              <w:rPr>
-                <w:sz w:val="19"/>
-                <w:szCs w:val="19"/>
-              </w:rPr>
-              <w:t>5 per advance</w:t>
+              <w:t>৳5 per advance</w:t>
             </w:r>
           </w:p>
         </w:tc>
       </w:tr>
       <w:tr>
-        <w:tblPrEx>
-          <w:tblCellMar>
-            <w:top w:w="0" w:type="dxa"/>
-            <w:bottom w:w="0" w:type="dxa"/>
-          </w:tblCellMar>
-        </w:tblPrEx>
         <w:tc>
           <w:tcPr>
             <w:tcW w:w="3000" w:type="dxa"/>
@@ -9174,27 +9338,102 @@
                 <w:sz w:val="19"/>
                 <w:szCs w:val="19"/>
               </w:rPr>
-              <w:t>−</w:t>
-            </w:r>
+              <w:t>−৳10,876</w:t>
+            </w:r>
+          </w:p>
+        </w:tc>
+        <w:tc>
+          <w:tcPr>
+            <w:tcW w:w="4238" w:type="dxa"/>
+            <w:tcBorders>
+              <w:top w:val="single" w:sz="4" w:space="0" w:color="C9DDD6"/>
+              <w:left w:val="single" w:sz="4" w:space="0" w:color="C9DDD6"/>
+              <w:bottom w:val="single" w:sz="4" w:space="0" w:color="C9DDD6"/>
+              <w:right w:val="single" w:sz="4" w:space="0" w:color="C9DDD6"/>
+            </w:tcBorders>
+            <w:tcMar>
+              <w:top w:w="60" w:type="dxa"/>
+              <w:left w:w="100" w:type="dxa"/>
+              <w:bottom w:w="60" w:type="dxa"/>
+              <w:right w:w="100" w:type="dxa"/>
+            </w:tcMar>
+            <w:vAlign w:val="center"/>
+          </w:tcPr>
+          <w:p>
+            <w:pPr>
+              <w:spacing w:line="252" w:lineRule="auto"/>
+            </w:pPr>
+            <w:r>
+              <w:rPr>
+                <w:sz w:val="19"/>
+                <w:szCs w:val="19"/>
+              </w:rPr>
+              <w:t>loss at the ৳25 fee</w:t>
+            </w:r>
+          </w:p>
+        </w:tc>
+      </w:tr>
+      <w:tr>
+        <w:tc>
+          <w:tcPr>
+            <w:tcW w:w="3000" w:type="dxa"/>
+            <w:tcBorders>
+              <w:top w:val="single" w:sz="4" w:space="0" w:color="C9DDD6"/>
+              <w:left w:val="single" w:sz="4" w:space="0" w:color="C9DDD6"/>
+              <w:bottom w:val="single" w:sz="4" w:space="0" w:color="C9DDD6"/>
+              <w:right w:val="single" w:sz="4" w:space="0" w:color="C9DDD6"/>
+            </w:tcBorders>
+            <w:shd w:val="clear" w:color="auto" w:fill="F6FAF9"/>
+            <w:tcMar>
+              <w:top w:w="60" w:type="dxa"/>
+              <w:left w:w="100" w:type="dxa"/>
+              <w:bottom w:w="60" w:type="dxa"/>
+              <w:right w:w="100" w:type="dxa"/>
+            </w:tcMar>
+            <w:vAlign w:val="center"/>
+          </w:tcPr>
+          <w:p>
+            <w:pPr>
+              <w:spacing w:line="252" w:lineRule="auto"/>
+            </w:pPr>
             <w:r>
               <w:rPr>
                 <w:b/>
                 <w:bCs/>
-                <w:color w:val="B8322A"/>
-                <w:sz w:val="19"/>
-                <w:szCs w:val="19"/>
-              </w:rPr>
-              <w:t>৳</w:t>
-            </w:r>
+              </w:rPr>
+              <w:t>Break-even fee</w:t>
+            </w:r>
+          </w:p>
+        </w:tc>
+        <w:tc>
+          <w:tcPr>
+            <w:tcW w:w="2400" w:type="dxa"/>
+            <w:tcBorders>
+              <w:top w:val="single" w:sz="4" w:space="0" w:color="C9DDD6"/>
+              <w:left w:val="single" w:sz="4" w:space="0" w:color="C9DDD6"/>
+              <w:bottom w:val="single" w:sz="4" w:space="0" w:color="C9DDD6"/>
+              <w:right w:val="single" w:sz="4" w:space="0" w:color="C9DDD6"/>
+            </w:tcBorders>
+            <w:shd w:val="clear" w:color="auto" w:fill="F6FAF9"/>
+            <w:tcMar>
+              <w:top w:w="60" w:type="dxa"/>
+              <w:left w:w="100" w:type="dxa"/>
+              <w:bottom w:w="60" w:type="dxa"/>
+              <w:right w:w="100" w:type="dxa"/>
+            </w:tcMar>
+            <w:vAlign w:val="center"/>
+          </w:tcPr>
+          <w:p>
+            <w:pPr>
+              <w:spacing w:line="252" w:lineRule="auto"/>
+              <w:jc w:val="right"/>
+            </w:pPr>
             <w:r>
               <w:rPr>
                 <w:b/>
                 <w:bCs/>
-                <w:color w:val="B8322A"/>
-                <w:sz w:val="19"/>
-                <w:szCs w:val="19"/>
-              </w:rPr>
-              <w:t>10,876</w:t>
+              </w:rPr>
+              <w:t>৳49 (A) · ৳60 (B)</w:t>
             </w:r>
           </w:p>
         </w:tc>
@@ -9207,58 +9446,6 @@
               <w:bottom w:val="single" w:sz="4" w:space="0" w:color="C9DDD6"/>
               <w:right w:val="single" w:sz="4" w:space="0" w:color="C9DDD6"/>
             </w:tcBorders>
-            <w:tcMar>
-              <w:top w:w="60" w:type="dxa"/>
-              <w:left w:w="100" w:type="dxa"/>
-              <w:bottom w:w="60" w:type="dxa"/>
-              <w:right w:w="100" w:type="dxa"/>
-            </w:tcMar>
-            <w:vAlign w:val="center"/>
-          </w:tcPr>
-          <w:p>
-            <w:pPr>
-              <w:spacing w:line="252" w:lineRule="auto"/>
-            </w:pPr>
-            <w:r>
-              <w:rPr>
-                <w:sz w:val="19"/>
-                <w:szCs w:val="19"/>
-              </w:rPr>
-              <w:t xml:space="preserve">loss at the </w:t>
-            </w:r>
-            <w:r>
-              <w:rPr>
-                <w:sz w:val="19"/>
-                <w:szCs w:val="19"/>
-              </w:rPr>
-              <w:t>৳</w:t>
-            </w:r>
-            <w:r>
-              <w:rPr>
-                <w:sz w:val="19"/>
-                <w:szCs w:val="19"/>
-              </w:rPr>
-              <w:t>25 fee</w:t>
-            </w:r>
-          </w:p>
-        </w:tc>
-      </w:tr>
-      <w:tr>
-        <w:tblPrEx>
-          <w:tblCellMar>
-            <w:top w:w="0" w:type="dxa"/>
-            <w:bottom w:w="0" w:type="dxa"/>
-          </w:tblCellMar>
-        </w:tblPrEx>
-        <w:tc>
-          <w:tcPr>
-            <w:tcW w:w="3000" w:type="dxa"/>
-            <w:tcBorders>
-              <w:top w:val="single" w:sz="4" w:space="0" w:color="C9DDD6"/>
-              <w:left w:val="single" w:sz="4" w:space="0" w:color="C9DDD6"/>
-              <w:bottom w:val="single" w:sz="4" w:space="0" w:color="C9DDD6"/>
-              <w:right w:val="single" w:sz="4" w:space="0" w:color="C9DDD6"/>
-            </w:tcBorders>
             <w:shd w:val="clear" w:color="auto" w:fill="F6FAF9"/>
             <w:tcMar>
               <w:top w:w="60" w:type="dxa"/>
@@ -9274,122 +9461,10 @@
             </w:pPr>
             <w:r>
               <w:rPr>
-                <w:b/>
-                <w:bCs/>
-              </w:rPr>
-              <w:t>Break-even fee</w:t>
-            </w:r>
-          </w:p>
-        </w:tc>
-        <w:tc>
-          <w:tcPr>
-            <w:tcW w:w="2400" w:type="dxa"/>
-            <w:tcBorders>
-              <w:top w:val="single" w:sz="4" w:space="0" w:color="C9DDD6"/>
-              <w:left w:val="single" w:sz="4" w:space="0" w:color="C9DDD6"/>
-              <w:bottom w:val="single" w:sz="4" w:space="0" w:color="C9DDD6"/>
-              <w:right w:val="single" w:sz="4" w:space="0" w:color="C9DDD6"/>
-            </w:tcBorders>
-            <w:shd w:val="clear" w:color="auto" w:fill="F6FAF9"/>
-            <w:tcMar>
-              <w:top w:w="60" w:type="dxa"/>
-              <w:left w:w="100" w:type="dxa"/>
-              <w:bottom w:w="60" w:type="dxa"/>
-              <w:right w:w="100" w:type="dxa"/>
-            </w:tcMar>
-            <w:vAlign w:val="center"/>
-          </w:tcPr>
-          <w:p>
-            <w:pPr>
-              <w:spacing w:line="252" w:lineRule="auto"/>
-              <w:jc w:val="right"/>
-            </w:pPr>
-            <w:r>
-              <w:rPr>
-                <w:b/>
-                <w:bCs/>
-              </w:rPr>
-              <w:t>৳</w:t>
-            </w:r>
-            <w:r>
-              <w:rPr>
-                <w:b/>
-                <w:bCs/>
-              </w:rPr>
-              <w:t xml:space="preserve">49 (A) · </w:t>
-            </w:r>
-            <w:r>
-              <w:rPr>
-                <w:b/>
-                <w:bCs/>
-              </w:rPr>
-              <w:t>৳</w:t>
-            </w:r>
-            <w:r>
-              <w:rPr>
-                <w:b/>
-                <w:bCs/>
-              </w:rPr>
-              <w:t>60 (B)</w:t>
-            </w:r>
-          </w:p>
-        </w:tc>
-        <w:tc>
-          <w:tcPr>
-            <w:tcW w:w="4238" w:type="dxa"/>
-            <w:tcBorders>
-              <w:top w:val="single" w:sz="4" w:space="0" w:color="C9DDD6"/>
-              <w:left w:val="single" w:sz="4" w:space="0" w:color="C9DDD6"/>
-              <w:bottom w:val="single" w:sz="4" w:space="0" w:color="C9DDD6"/>
-              <w:right w:val="single" w:sz="4" w:space="0" w:color="C9DDD6"/>
-            </w:tcBorders>
-            <w:shd w:val="clear" w:color="auto" w:fill="F6FAF9"/>
-            <w:tcMar>
-              <w:top w:w="60" w:type="dxa"/>
-              <w:left w:w="100" w:type="dxa"/>
-              <w:bottom w:w="60" w:type="dxa"/>
-              <w:right w:w="100" w:type="dxa"/>
-            </w:tcMar>
-            <w:vAlign w:val="center"/>
-          </w:tcPr>
-          <w:p>
-            <w:pPr>
-              <w:spacing w:line="252" w:lineRule="auto"/>
-            </w:pPr>
-            <w:r>
-              <w:rPr>
-                <w:sz w:val="19"/>
-                <w:szCs w:val="19"/>
-              </w:rPr>
-              <w:t xml:space="preserve">1.4% one-time fee on a </w:t>
-            </w:r>
-            <w:r>
-              <w:rPr>
-                <w:sz w:val="19"/>
-                <w:szCs w:val="19"/>
-              </w:rPr>
-              <w:t>৳</w:t>
-            </w:r>
-            <w:r>
-              <w:rPr>
-                <w:sz w:val="19"/>
-                <w:szCs w:val="19"/>
-              </w:rPr>
-              <w:t xml:space="preserve">3,600 advance at </w:t>
-            </w:r>
-            <w:r>
-              <w:rPr>
-                <w:sz w:val="19"/>
-                <w:szCs w:val="19"/>
-              </w:rPr>
-              <w:t>৳</w:t>
-            </w:r>
-            <w:r>
-              <w:rPr>
-                <w:sz w:val="19"/>
-                <w:szCs w:val="19"/>
-              </w:rPr>
-              <w:t>49</w:t>
+                <w:sz w:val="19"/>
+                <w:szCs w:val="19"/>
+              </w:rPr>
+              <w:t>1.4% one-time fee on a ৳3,600 advance at ৳49</w:t>
             </w:r>
           </w:p>
         </w:tc>
@@ -9405,13 +9480,7 @@
         <w:spacing w:after="120" w:line="276" w:lineRule="auto"/>
       </w:pPr>
       <w:r>
-        <w:t xml:space="preserve">The flat </w:t>
-      </w:r>
-      <w:r>
-        <w:t>৳</w:t>
-      </w:r>
-      <w:r>
-        <w:t>25 fee does not cover costs in the sandbox; we show this openly rather than tuning it away. Paths to viability are a fee near the break-even, an employer co-paying part of the fee as a staff benefit, and the indirect value of payroll inflow and active wallets. Every assumption can be changed on the Validation page.</w:t>
+        <w:t>The flat ৳25 fee does not cover costs in the sandbox; we show this openly rather than tuning it away. Paths to viability are a fee near the break-even, an employer co-paying part of the fee as a staff benefit, and the indirect value of payroll inflow and active wallets. Every assumption can be changed on the Validation page.</w:t>
       </w:r>
     </w:p>
     <w:p>
@@ -9447,12 +9516,6 @@
         <w:gridCol w:w="2638"/>
       </w:tblGrid>
       <w:tr>
-        <w:tblPrEx>
-          <w:tblCellMar>
-            <w:top w:w="0" w:type="dxa"/>
-            <w:bottom w:w="0" w:type="dxa"/>
-          </w:tblCellMar>
-        </w:tblPrEx>
         <w:trPr>
           <w:tblHeader/>
         </w:trPr>
@@ -9560,12 +9623,6 @@
         </w:tc>
       </w:tr>
       <w:tr>
-        <w:tblPrEx>
-          <w:tblCellMar>
-            <w:top w:w="0" w:type="dxa"/>
-            <w:bottom w:w="0" w:type="dxa"/>
-          </w:tblCellMar>
-        </w:tblPrEx>
         <w:tc>
           <w:tcPr>
             <w:tcW w:w="2100" w:type="dxa"/>
@@ -9658,12 +9715,6 @@
         </w:tc>
       </w:tr>
       <w:tr>
-        <w:tblPrEx>
-          <w:tblCellMar>
-            <w:top w:w="0" w:type="dxa"/>
-            <w:bottom w:w="0" w:type="dxa"/>
-          </w:tblCellMar>
-        </w:tblPrEx>
         <w:tc>
           <w:tcPr>
             <w:tcW w:w="2100" w:type="dxa"/>
@@ -9722,7 +9773,23 @@
                 <w:sz w:val="19"/>
                 <w:szCs w:val="19"/>
               </w:rPr>
-              <w:t>Retrain and re-validate on governed, anonymised payroll and repayment data.</w:t>
+              <w:t xml:space="preserve">Retrain and re-validate on governed, </w:t>
+            </w:r>
+            <w:proofErr w:type="spellStart"/>
+            <w:r>
+              <w:rPr>
+                <w:sz w:val="19"/>
+                <w:szCs w:val="19"/>
+              </w:rPr>
+              <w:t>anonymised</w:t>
+            </w:r>
+            <w:proofErr w:type="spellEnd"/>
+            <w:r>
+              <w:rPr>
+                <w:sz w:val="19"/>
+                <w:szCs w:val="19"/>
+              </w:rPr>
+              <w:t xml:space="preserve"> payroll and repayment data.</w:t>
             </w:r>
           </w:p>
         </w:tc>
@@ -9759,12 +9826,6 @@
         </w:tc>
       </w:tr>
       <w:tr>
-        <w:tblPrEx>
-          <w:tblCellMar>
-            <w:top w:w="0" w:type="dxa"/>
-            <w:bottom w:w="0" w:type="dxa"/>
-          </w:tblCellMar>
-        </w:tblPrEx>
         <w:tc>
           <w:tcPr>
             <w:tcW w:w="2100" w:type="dxa"/>
@@ -9821,7 +9882,23 @@
                 <w:sz w:val="19"/>
                 <w:szCs w:val="19"/>
               </w:rPr>
-              <w:t>One garment employer, real payroll file, upay sandbox wallets, weekly reviews with HR and operations.</w:t>
+              <w:t xml:space="preserve">One garment employer, real payroll file, </w:t>
+            </w:r>
+            <w:proofErr w:type="spellStart"/>
+            <w:r>
+              <w:rPr>
+                <w:sz w:val="19"/>
+                <w:szCs w:val="19"/>
+              </w:rPr>
+              <w:t>upay</w:t>
+            </w:r>
+            <w:proofErr w:type="spellEnd"/>
+            <w:r>
+              <w:rPr>
+                <w:sz w:val="19"/>
+                <w:szCs w:val="19"/>
+              </w:rPr>
+              <w:t xml:space="preserve"> sandbox wallets, weekly reviews with HR and operations.</w:t>
             </w:r>
           </w:p>
         </w:tc>
@@ -9857,12 +9934,6 @@
         </w:tc>
       </w:tr>
       <w:tr>
-        <w:tblPrEx>
-          <w:tblCellMar>
-            <w:top w:w="0" w:type="dxa"/>
-            <w:bottom w:w="0" w:type="dxa"/>
-          </w:tblCellMar>
-        </w:tblPrEx>
         <w:tc>
           <w:tcPr>
             <w:tcW w:w="2100" w:type="dxa"/>
@@ -9921,7 +9992,39 @@
                 <w:sz w:val="19"/>
                 <w:szCs w:val="19"/>
               </w:rPr>
-              <w:t>Module inside the upay app, employer portal, upay KYC and ledger, regulatory review.</w:t>
+              <w:t xml:space="preserve">Module inside the </w:t>
+            </w:r>
+            <w:proofErr w:type="spellStart"/>
+            <w:r>
+              <w:rPr>
+                <w:sz w:val="19"/>
+                <w:szCs w:val="19"/>
+              </w:rPr>
+              <w:t>upay</w:t>
+            </w:r>
+            <w:proofErr w:type="spellEnd"/>
+            <w:r>
+              <w:rPr>
+                <w:sz w:val="19"/>
+                <w:szCs w:val="19"/>
+              </w:rPr>
+              <w:t xml:space="preserve"> app, employer portal, </w:t>
+            </w:r>
+            <w:proofErr w:type="spellStart"/>
+            <w:r>
+              <w:rPr>
+                <w:sz w:val="19"/>
+                <w:szCs w:val="19"/>
+              </w:rPr>
+              <w:t>upay</w:t>
+            </w:r>
+            <w:proofErr w:type="spellEnd"/>
+            <w:r>
+              <w:rPr>
+                <w:sz w:val="19"/>
+                <w:szCs w:val="19"/>
+              </w:rPr>
+              <w:t xml:space="preserve"> KYC and ledger, regulatory review.</w:t>
             </w:r>
           </w:p>
         </w:tc>
@@ -9991,7 +10094,15 @@
         <w:spacing w:after="60" w:line="264" w:lineRule="auto"/>
       </w:pPr>
       <w:r>
-        <w:t>All results come from synthetic worlds; real behaviour will differ and must be re-validated.</w:t>
+        <w:t xml:space="preserve">All results come from synthetic worlds; real </w:t>
+      </w:r>
+      <w:proofErr w:type="spellStart"/>
+      <w:r>
+        <w:t>behaviour</w:t>
+      </w:r>
+      <w:proofErr w:type="spellEnd"/>
+      <w:r>
+        <w:t xml:space="preserve"> will differ and must be re-validated.</w:t>
       </w:r>
     </w:p>
     <w:p>
@@ -10030,13 +10141,7 @@
         <w:spacing w:after="60" w:line="264" w:lineRule="auto"/>
       </w:pPr>
       <w:r>
-        <w:t xml:space="preserve">At the </w:t>
-      </w:r>
-      <w:r>
-        <w:t>৳</w:t>
-      </w:r>
-      <w:r>
-        <w:t>25 fee the product loses money in the sandbox (Section 8.2).</w:t>
+        <w:t>At the ৳25 fee the product loses money in the sandbox (Section 8.2).</w:t>
       </w:r>
     </w:p>
     <w:p>
@@ -10073,7 +10178,7 @@
         </w:rPr>
         <w:t xml:space="preserve">Live: </w:t>
       </w:r>
-      <w:hyperlink r:id="rId15" w:history="1">
+      <w:hyperlink r:id="rId16" w:history="1">
         <w:r>
           <w:rPr>
             <w:rStyle w:val="Hyperlink"/>
@@ -10091,7 +10196,7 @@
         </w:rPr>
         <w:t xml:space="preserve">Code: </w:t>
       </w:r>
-      <w:hyperlink r:id="rId16" w:history="1">
+      <w:hyperlink r:id="rId17" w:history="1">
         <w:r>
           <w:rPr>
             <w:rStyle w:val="Hyperlink"/>
@@ -10105,13 +10210,47 @@
         <w:spacing w:after="120" w:line="276" w:lineRule="auto"/>
       </w:pPr>
       <w:r>
-        <w:t xml:space="preserve">The README gives step-by-step setup, environment variables, run, build and test commands. In short: install backend/requirements-dev.txt on Python 3.11 and run uvicorn; run npm install and npm run dev in frontend; run pytest for the 229 automated tests. To verify by hand, press ★ Demo mode, request Rahim's </w:t>
-      </w:r>
-      <w:r>
-        <w:t>৳</w:t>
-      </w:r>
-      <w:r>
-        <w:t>3,600 advance, open Employer HR and jump to payday, then run scenario S6 on the upay Ops page.</w:t>
+        <w:t xml:space="preserve">The README gives step-by-step setup, environment variables, run, build and test commands. In short: install backend/requirements-dev.txt on Python 3.11 and run </w:t>
+      </w:r>
+      <w:proofErr w:type="spellStart"/>
+      <w:r>
+        <w:t>uvicorn</w:t>
+      </w:r>
+      <w:proofErr w:type="spellEnd"/>
+      <w:r>
+        <w:t xml:space="preserve">; run </w:t>
+      </w:r>
+      <w:proofErr w:type="spellStart"/>
+      <w:r>
+        <w:t>npm</w:t>
+      </w:r>
+      <w:proofErr w:type="spellEnd"/>
+      <w:r>
+        <w:t xml:space="preserve"> install and </w:t>
+      </w:r>
+      <w:proofErr w:type="spellStart"/>
+      <w:r>
+        <w:t>npm</w:t>
+      </w:r>
+      <w:proofErr w:type="spellEnd"/>
+      <w:r>
+        <w:t xml:space="preserve"> run dev in frontend; run </w:t>
+      </w:r>
+      <w:proofErr w:type="spellStart"/>
+      <w:r>
+        <w:t>pytest</w:t>
+      </w:r>
+      <w:proofErr w:type="spellEnd"/>
+      <w:r>
+        <w:t xml:space="preserve"> for the 229 automated tests. To verify by hand, press ★ Demo mode, request Rahim's ৳3,600 advance, open Employer HR and jump to payday, then run scenario S6 on the </w:t>
+      </w:r>
+      <w:proofErr w:type="spellStart"/>
+      <w:r>
+        <w:t>upay</w:t>
+      </w:r>
+      <w:proofErr w:type="spellEnd"/>
+      <w:r>
+        <w:t xml:space="preserve"> Ops page.</w:t>
       </w:r>
     </w:p>
     <w:p>
@@ -10130,7 +10269,15 @@
         <w:spacing w:after="120" w:line="276" w:lineRule="auto"/>
       </w:pPr>
       <w:r>
-        <w:t>Every number is a labelled assumption in backend/app/config.py and docs/assumptions.md, and can be overridden by environment variable.</w:t>
+        <w:t xml:space="preserve">Every number is a labelled assumption in backend/app/config.py and </w:t>
+      </w:r>
+      <w:proofErr w:type="gramStart"/>
+      <w:r>
+        <w:t>docs/assumptions.md, and</w:t>
+      </w:r>
+      <w:proofErr w:type="gramEnd"/>
+      <w:r>
+        <w:t xml:space="preserve"> can be overridden by environment variable.</w:t>
       </w:r>
     </w:p>
     <w:tbl>
@@ -10155,12 +10302,6 @@
         <w:gridCol w:w="6038"/>
       </w:tblGrid>
       <w:tr>
-        <w:tblPrEx>
-          <w:tblCellMar>
-            <w:top w:w="0" w:type="dxa"/>
-            <w:bottom w:w="0" w:type="dxa"/>
-          </w:tblCellMar>
-        </w:tblPrEx>
         <w:trPr>
           <w:tblHeader/>
         </w:trPr>
@@ -10234,12 +10375,6 @@
         </w:tc>
       </w:tr>
       <w:tr>
-        <w:tblPrEx>
-          <w:tblCellMar>
-            <w:top w:w="0" w:type="dxa"/>
-            <w:bottom w:w="0" w:type="dxa"/>
-          </w:tblCellMar>
-        </w:tblPrEx>
         <w:tc>
           <w:tcPr>
             <w:tcW w:w="3600" w:type="dxa"/>
@@ -10302,12 +10437,6 @@
         </w:tc>
       </w:tr>
       <w:tr>
-        <w:tblPrEx>
-          <w:tblCellMar>
-            <w:top w:w="0" w:type="dxa"/>
-            <w:bottom w:w="0" w:type="dxa"/>
-          </w:tblCellMar>
-        </w:tblPrEx>
         <w:tc>
           <w:tcPr>
             <w:tcW w:w="3600" w:type="dxa"/>
@@ -10366,25 +10495,12 @@
                 <w:sz w:val="19"/>
                 <w:szCs w:val="19"/>
               </w:rPr>
-              <w:t>৳</w:t>
-            </w:r>
-            <w:r>
-              <w:rPr>
-                <w:sz w:val="19"/>
-                <w:szCs w:val="19"/>
-              </w:rPr>
-              <w:t>500 / 90 days / 2 advances</w:t>
+              <w:t>৳500 / 90 days / 2 advances</w:t>
             </w:r>
           </w:p>
         </w:tc>
       </w:tr>
       <w:tr>
-        <w:tblPrEx>
-          <w:tblCellMar>
-            <w:top w:w="0" w:type="dxa"/>
-            <w:bottom w:w="0" w:type="dxa"/>
-          </w:tblCellMar>
-        </w:tblPrEx>
         <w:tc>
           <w:tcPr>
             <w:tcW w:w="3600" w:type="dxa"/>
@@ -10441,32 +10557,12 @@
                 <w:sz w:val="19"/>
                 <w:szCs w:val="19"/>
               </w:rPr>
-              <w:t xml:space="preserve">Flat </w:t>
-            </w:r>
-            <w:r>
-              <w:rPr>
-                <w:sz w:val="19"/>
-                <w:szCs w:val="19"/>
-              </w:rPr>
-              <w:t>৳</w:t>
-            </w:r>
-            <w:r>
-              <w:rPr>
-                <w:sz w:val="19"/>
-                <w:szCs w:val="19"/>
-              </w:rPr>
-              <w:t>25, no interest</w:t>
+              <w:t>Flat ৳25, no interest</w:t>
             </w:r>
           </w:p>
         </w:tc>
       </w:tr>
       <w:tr>
-        <w:tblPrEx>
-          <w:tblCellMar>
-            <w:top w:w="0" w:type="dxa"/>
-            <w:bottom w:w="0" w:type="dxa"/>
-          </w:tblCellMar>
-        </w:tblPrEx>
         <w:tc>
           <w:tcPr>
             <w:tcW w:w="3600" w:type="dxa"/>
@@ -10531,12 +10627,6 @@
         </w:tc>
       </w:tr>
       <w:tr>
-        <w:tblPrEx>
-          <w:tblCellMar>
-            <w:top w:w="0" w:type="dxa"/>
-            <w:bottom w:w="0" w:type="dxa"/>
-          </w:tblCellMar>
-        </w:tblPrEx>
         <w:tc>
           <w:tcPr>
             <w:tcW w:w="3600" w:type="dxa"/>
@@ -10599,12 +10689,6 @@
         </w:tc>
       </w:tr>
       <w:tr>
-        <w:tblPrEx>
-          <w:tblCellMar>
-            <w:top w:w="0" w:type="dxa"/>
-            <w:bottom w:w="0" w:type="dxa"/>
-          </w:tblCellMar>
-        </w:tblPrEx>
         <w:tc>
           <w:tcPr>
             <w:tcW w:w="3600" w:type="dxa"/>
@@ -10669,12 +10753,6 @@
         </w:tc>
       </w:tr>
       <w:tr>
-        <w:tblPrEx>
-          <w:tblCellMar>
-            <w:top w:w="0" w:type="dxa"/>
-            <w:bottom w:w="0" w:type="dxa"/>
-          </w:tblCellMar>
-        </w:tblPrEx>
         <w:tc>
           <w:tcPr>
             <w:tcW w:w="3600" w:type="dxa"/>
@@ -10737,12 +10815,6 @@
         </w:tc>
       </w:tr>
       <w:tr>
-        <w:tblPrEx>
-          <w:tblCellMar>
-            <w:top w:w="0" w:type="dxa"/>
-            <w:bottom w:w="0" w:type="dxa"/>
-          </w:tblCellMar>
-        </w:tblPrEx>
         <w:tc>
           <w:tcPr>
             <w:tcW w:w="3600" w:type="dxa"/>
@@ -10801,25 +10873,12 @@
                 <w:sz w:val="19"/>
                 <w:szCs w:val="19"/>
               </w:rPr>
-              <w:t>৳</w:t>
-            </w:r>
-            <w:r>
-              <w:rPr>
-                <w:sz w:val="19"/>
-                <w:szCs w:val="19"/>
-              </w:rPr>
-              <w:t>10,000 or more; top 2% of borrowing patterns</w:t>
+              <w:t>৳10,000 or more; top 2% of borrowing patterns</w:t>
             </w:r>
           </w:p>
         </w:tc>
       </w:tr>
       <w:tr>
-        <w:tblPrEx>
-          <w:tblCellMar>
-            <w:top w:w="0" w:type="dxa"/>
-            <w:bottom w:w="0" w:type="dxa"/>
-          </w:tblCellMar>
-        </w:tblPrEx>
         <w:tc>
           <w:tcPr>
             <w:tcW w:w="3600" w:type="dxa"/>
@@ -10882,12 +10941,6 @@
         </w:tc>
       </w:tr>
       <w:tr>
-        <w:tblPrEx>
-          <w:tblCellMar>
-            <w:top w:w="0" w:type="dxa"/>
-            <w:bottom w:w="0" w:type="dxa"/>
-          </w:tblCellMar>
-        </w:tblPrEx>
         <w:tc>
           <w:tcPr>
             <w:tcW w:w="3600" w:type="dxa"/>
@@ -10946,35 +10999,7 @@
                 <w:sz w:val="19"/>
                 <w:szCs w:val="19"/>
               </w:rPr>
-              <w:t xml:space="preserve">Initial pool </w:t>
-            </w:r>
-            <w:r>
-              <w:rPr>
-                <w:sz w:val="19"/>
-                <w:szCs w:val="19"/>
-              </w:rPr>
-              <w:t>৳</w:t>
-            </w:r>
-            <w:r>
-              <w:rPr>
-                <w:sz w:val="19"/>
-                <w:szCs w:val="19"/>
-              </w:rPr>
-              <w:t xml:space="preserve">50,00,000; buffer 15%; cost of capital 12% a year; operations </w:t>
-            </w:r>
-            <w:r>
-              <w:rPr>
-                <w:sz w:val="19"/>
-                <w:szCs w:val="19"/>
-              </w:rPr>
-              <w:t>৳</w:t>
-            </w:r>
-            <w:r>
-              <w:rPr>
-                <w:sz w:val="19"/>
-                <w:szCs w:val="19"/>
-              </w:rPr>
-              <w:t>5 per advance</w:t>
+              <w:t>Initial pool ৳50,00,000; buffer 15%; cost of capital 12% a year; operations ৳5 per advance</w:t>
             </w:r>
           </w:p>
         </w:tc>
@@ -10982,7 +11007,7 @@
     </w:tbl>
     <w:p/>
     <w:sectPr>
-      <w:footerReference w:type="default" r:id="rId17"/>
+      <w:footerReference w:type="default" r:id="rId18"/>
       <w:pgSz w:w="11906" w:h="16838"/>
       <w:pgMar w:top="1134" w:right="1134" w:bottom="1134" w:left="1134" w:header="708" w:footer="708" w:gutter="0"/>
       <w:cols w:space="720"/>
@@ -11749,7 +11774,6 @@
   <w:style w:type="character" w:default="1" w:styleId="DefaultParagraphFont">
     <w:name w:val="Default Paragraph Font"/>
     <w:uiPriority w:val="1"/>
-    <w:semiHidden/>
     <w:unhideWhenUsed/>
   </w:style>
   <w:style w:type="table" w:default="1" w:styleId="TableNormal">
@@ -11896,6 +11920,60 @@
       <w:spacing w:after="100"/>
       <w:ind w:left="220"/>
     </w:pPr>
+  </w:style>
+  <w:style w:type="paragraph" w:styleId="Header">
+    <w:name w:val="header"/>
+    <w:basedOn w:val="Normal"/>
+    <w:link w:val="HeaderChar"/>
+    <w:uiPriority w:val="99"/>
+    <w:unhideWhenUsed/>
+    <w:rsid w:val="001D5FA2"/>
+    <w:pPr>
+      <w:tabs>
+        <w:tab w:val="center" w:pos="4680"/>
+        <w:tab w:val="right" w:pos="9360"/>
+      </w:tabs>
+    </w:pPr>
+  </w:style>
+  <w:style w:type="character" w:customStyle="1" w:styleId="HeaderChar">
+    <w:name w:val="Header Char"/>
+    <w:basedOn w:val="DefaultParagraphFont"/>
+    <w:link w:val="Header"/>
+    <w:uiPriority w:val="99"/>
+    <w:rsid w:val="001D5FA2"/>
+  </w:style>
+  <w:style w:type="paragraph" w:styleId="Footer">
+    <w:name w:val="footer"/>
+    <w:basedOn w:val="Normal"/>
+    <w:link w:val="FooterChar"/>
+    <w:uiPriority w:val="99"/>
+    <w:unhideWhenUsed/>
+    <w:rsid w:val="001D5FA2"/>
+    <w:pPr>
+      <w:tabs>
+        <w:tab w:val="center" w:pos="4680"/>
+        <w:tab w:val="right" w:pos="9360"/>
+      </w:tabs>
+    </w:pPr>
+  </w:style>
+  <w:style w:type="character" w:customStyle="1" w:styleId="FooterChar">
+    <w:name w:val="Footer Char"/>
+    <w:basedOn w:val="DefaultParagraphFont"/>
+    <w:link w:val="Footer"/>
+    <w:uiPriority w:val="99"/>
+    <w:rsid w:val="001D5FA2"/>
+  </w:style>
+  <w:style w:type="character" w:styleId="UnresolvedMention">
+    <w:name w:val="Unresolved Mention"/>
+    <w:basedOn w:val="DefaultParagraphFont"/>
+    <w:uiPriority w:val="99"/>
+    <w:semiHidden/>
+    <w:unhideWhenUsed/>
+    <w:rsid w:val="000B16D3"/>
+    <w:rPr>
+      <w:color w:val="605E5C"/>
+      <w:shd w:val="clear" w:color="auto" w:fill="E1DFDD"/>
+    </w:rPr>
   </w:style>
 </w:styles>
 </file>

</xml_diff>

<commit_message>
docs: keep submission files out of the public repo
The report and slides are submitted through the portal and carry the
team's student IDs and emails, so they are no longer tracked.
</commit_message>
<xml_diff>
--- a/docs/report/SalaryBridge_Project_Report.docx
+++ b/docs/report/SalaryBridge_Project_Report.docx
@@ -317,7 +317,21 @@
                 <w:sz w:val="19"/>
                 <w:szCs w:val="19"/>
               </w:rPr>
-              <w:t>Leader, Frontend, Ai Engineer</w:t>
+              <w:t>Leader, Frontend, A</w:t>
+            </w:r>
+            <w:r>
+              <w:rPr>
+                <w:sz w:val="19"/>
+                <w:szCs w:val="19"/>
+              </w:rPr>
+              <w:t>I</w:t>
+            </w:r>
+            <w:r>
+              <w:rPr>
+                <w:sz w:val="19"/>
+                <w:szCs w:val="19"/>
+              </w:rPr>
+              <w:t xml:space="preserve"> Engineer</w:t>
             </w:r>
             <w:r>
               <w:rPr>
@@ -360,6 +374,15 @@
             </w:r>
             <w:r>
               <w:rPr>
+                <w:b/>
+                <w:bCs/>
+                <w:sz w:val="19"/>
+                <w:szCs w:val="19"/>
+              </w:rPr>
+              <w:t xml:space="preserve"> </w:t>
+            </w:r>
+            <w:r>
+              <w:rPr>
                 <w:sz w:val="19"/>
                 <w:szCs w:val="19"/>
               </w:rPr>
@@ -370,7 +393,21 @@
                 <w:sz w:val="19"/>
                 <w:szCs w:val="19"/>
               </w:rPr>
-              <w:t>Ai/ML</w:t>
+              <w:t>A</w:t>
+            </w:r>
+            <w:r>
+              <w:rPr>
+                <w:sz w:val="19"/>
+                <w:szCs w:val="19"/>
+              </w:rPr>
+              <w:t>I</w:t>
+            </w:r>
+            <w:r>
+              <w:rPr>
+                <w:sz w:val="19"/>
+                <w:szCs w:val="19"/>
+              </w:rPr>
+              <w:t>/ML</w:t>
             </w:r>
             <w:r>
               <w:rPr>
@@ -3175,7 +3212,23 @@
                 <w:sz w:val="19"/>
                 <w:szCs w:val="19"/>
               </w:rPr>
-              <w:t xml:space="preserve">The worker opens SalaryBridge in </w:t>
+              <w:t xml:space="preserve">The worker opens </w:t>
+            </w:r>
+            <w:proofErr w:type="spellStart"/>
+            <w:r>
+              <w:rPr>
+                <w:sz w:val="19"/>
+                <w:szCs w:val="19"/>
+              </w:rPr>
+              <w:t>SalaryBridge</w:t>
+            </w:r>
+            <w:proofErr w:type="spellEnd"/>
+            <w:r>
+              <w:rPr>
+                <w:sz w:val="19"/>
+                <w:szCs w:val="19"/>
+              </w:rPr>
+              <w:t xml:space="preserve"> in </w:t>
             </w:r>
             <w:proofErr w:type="spellStart"/>
             <w:r>
@@ -11042,13 +11095,23 @@
     <w:pPr>
       <w:jc w:val="center"/>
     </w:pPr>
+    <w:proofErr w:type="spellStart"/>
     <w:r>
       <w:rPr>
         <w:color w:val="5B6B73"/>
         <w:sz w:val="16"/>
         <w:szCs w:val="16"/>
       </w:rPr>
-      <w:t xml:space="preserve">SalaryBridge · Project Report · page </w:t>
+      <w:t>SalaryBridge</w:t>
+    </w:r>
+    <w:proofErr w:type="spellEnd"/>
+    <w:r>
+      <w:rPr>
+        <w:color w:val="5B6B73"/>
+        <w:sz w:val="16"/>
+        <w:szCs w:val="16"/>
+      </w:rPr>
+      <w:t xml:space="preserve"> · Project Report · page </w:t>
     </w:r>
     <w:r>
       <w:rPr>
@@ -11774,6 +11837,7 @@
   <w:style w:type="character" w:default="1" w:styleId="DefaultParagraphFont">
     <w:name w:val="Default Paragraph Font"/>
     <w:uiPriority w:val="1"/>
+    <w:semiHidden/>
     <w:unhideWhenUsed/>
   </w:style>
   <w:style w:type="table" w:default="1" w:styleId="TableNormal">

</xml_diff>